<commit_message>
docs: expand Chinese literature review with DeepTutor
Add education learner-modeling synthesis, a qualitative comparison table, verified DeepTutor v1 discussion, and five references. Rebuild and visually inspect all 17 pages; preserve existing experimental results and figures. Contract impact: none; no product changes or new experiments.
</commit_message>
<xml_diff>
--- a/docs/research/education-memory-v2-paper/LearnFlow_Educational_Memory_Manuscript_ZH.docx
+++ b/docs/research/education-memory-v2-paper/LearnFlow_Educational_Memory_Manuscript_ZH.docx
@@ -72,7 +72,12 @@
         <w:pStyle w:val="Heading1"/>
       </w:pPr>
       <w:r>
-        <w:t>2 相关工作</w:t>
+        <w:t>2 文献综述与研究定位</w:t>
+      </w:r>
+    </w:p>
+    <w:p>
+      <w:r>
+        <w:t>本节采用问题导向的叙述性综述，围绕学习者画像的形成、记忆的组织与更新，以及教学效果的验证梳理代表性研究。文献核验截至 2026 年 9 月 9 日，以原始论文和正式出版记录为依据；这不是穷尽检索的系统综述，也不据此声称某项能力在整个领域中尚不存在。比较的重点是各工作的研究对象、更新机制与实际测量边界，而不是将不同数据集上的分数拼接为排名。</w:t>
       </w:r>
     </w:p>
     <w:p>
@@ -80,17 +85,22 @@
         <w:pStyle w:val="Heading2"/>
       </w:pPr>
       <w:r>
-        <w:t>2.1 学习者建模与教学证据</w:t>
+        <w:t>2.1 学习者建模与开放学习者模型</w:t>
       </w:r>
     </w:p>
     <w:p>
       <w:r>
-        <w:t>Corbett 和 Anderson 在编程辅导场景中建模程序性知识变化，并据此调整练习[1]；Piech 等利用循环神经网络表示学习交互序列[2]。这些研究确立了依据连续观察而非单次答案判断学习状态的思路。LearnFlow 研究的是将已有观察组织为可供智能体读取的证据，而非训练新的掌握概率预测模型。本文没有知识追踪 AUC 对比，也不认为五个工程状态维度可以替代经验证的学习理论或心理测量模型。</w:t>
+        <w:t>学习者画像首先是对学习过程的解释，而不仅是对话偏好的集合。Corbett 和 Anderson 的知识追踪根据练习表现估计程序性知识状态[1]；深度知识追踪进一步利用神经网络表示学习交互序列[2]。二者关注随观察变化的知识状态，为自适应练习提供依据。对本文而言，这条研究路线提示应保留时间序列和表现条件，但知识状态预测与证据送达仍是不同任务：预测下一题能否答对，并不直接回答有限上下文中保留了哪条评估记录。</w:t>
       </w:r>
     </w:p>
     <w:p>
       <w:r>
-        <w:t>计算机任务中的支持条件直接影响证据解释。查看步骤后完成同一道题，可以证明在支持条件下完成任务；独立完成具有实质变化的任务，才提供另一类观察。本文实现的确定性规则维护这种区分，但“规则得到遵守”和“规则适合真实教学”仍是不同问题。后者需要教师判断和学习者研究。</w:t>
+        <w:t>开放学习者模型进一步将画像作为学习者可以理解和参与的对象。Bull 和 Kay 的 SMILI 框架为开放学习者模型及学习数据界面的描述、比较和设计提供了组织方式[14]。Bull 等的可协商模型允许学习者查看学习信息并提出修改，研究其对可视化、证据查看和模型修订功能的初始反应[18]。这一方向把画像透明性与学习者反思联系起来，也说明“系统能够展示画像”和“学习者能够理解、质疑并有效修正画像”应分别验证。</w:t>
+      </w:r>
+    </w:p>
+    <w:p>
+      <w:r>
+        <w:t>因此，教育记忆至少涉及两种不同的正确性：系统内部能否追溯画像判断，学习者能否理解并纠正这一判断。LearnFlow 本文评测集中于前者及其读取结果，没有开展画像界面的可用性实验，也没有验证学习者参与修订是否改善元认知。五个工程状态维度不替代经验证的学习理论或心理测量模型，本文也未进行知识追踪 AUC 对比。</w:t>
       </w:r>
     </w:p>
     <w:p>
@@ -98,17 +108,17 @@
         <w:pStyle w:val="Heading2"/>
       </w:pPr>
       <w:r>
-        <w:t>2.2 智能体记忆与检索</w:t>
+        <w:t>2.2 教学辅助条件与表现证据</w:t>
       </w:r>
     </w:p>
     <w:p>
       <w:r>
-        <w:t>MemGPT 通过多层记忆管理有限上下文[3]；Generative Agents 将观察、反思和经验检索结合用于行为规划[4]；A-MEM 通过关联笔记组织和更新记忆[5]。这些方法支持超越短期对话缓存的记忆设计，但其公开实验不能替代本文系统上的直接对比。LearnFlow 的长期画像由确定性事件归约维护，模型生成的讲解或摘要不能自行成为掌握证据。</w:t>
+        <w:t>Koedinger 和 Aleven 将何时提供信息、何时让学习者自行生成步骤作为教学中的辅助困境，讨论认知导师中的反馈、提示、自我解释和问题选择[15]。其研究意味着支持程度本身就是教学干预的一部分，不能从最终答案正确与否推断整个学习过程。支持可能促进当前任务完成，而独立执行、保持和迁移需要各自的测量。</w:t>
       </w:r>
     </w:p>
     <w:p>
       <w:r>
-        <w:t>检索增强生成将外部信息检索与生成模型结合[10]。本文将评估边界置于自由文本生成之前，分别检查证据是否送达和确定性规划是否使用了适用证据，以减少模型评判器带来的解释混杂。词法通道采用有界候选池内的 BM25 重排[11]，因此不能称为稠密语义检索。本文未实际执行稠密检索、长上下文生成、MemGPT 或 A-MEM 等强基线的性能对照。</w:t>
+        <w:t>在计算机教学中，这一区别可以具体表现为查看代码示例后修正程序、按照提示完成 SQL 查询，以及独立处理新的边界条件。这些是本文研究问题的情境化说明，不是新增实验观察。若记忆将上述过程都压缩成“任务通过”，后续规划便可能失去撤除辅助或安排变式检查的依据。因此，我们把辅助条件与评估结果共同送达作为工程要求；这一要求的执行效果可以由日志验证，但具体教学策略是否有效仍需学习实验，而不能由规则的一致性代替。</w:t>
       </w:r>
     </w:p>
     <w:p>
@@ -116,17 +126,818 @@
         <w:pStyle w:val="Heading2"/>
       </w:pPr>
       <w:r>
-        <w:t>2.3 记忆评测与来源溯源</w:t>
+        <w:t>2.3 智能体长期记忆的组织与更新</w:t>
       </w:r>
     </w:p>
     <w:p>
       <w:r>
-        <w:t>LoCoMo 面向长对话历史设置包括问答在内的任务[6]；LongMemEval 覆盖信息抽取、多会话推理、时间推理、知识更新与拒答[7]；LoCoMo-Plus 关注检索提示不直接时的隐含约束应用[8]；AMemGym 引入具有结构化状态演化的交互式评估[9]。本文只对 LoCoMo 的标注来源证据进行检索适配，未运行其官方答案生成评分，也未运行后三个基准，因此结果不能与其官方分数直接比较。</w:t>
+        <w:t>智能体记忆研究提供了处理长历史的多种表示。MemGPT 通过分层记忆管理扩展有限上下文的使用范围[3]；Generative Agents 将观察、反思与检索结合用于行为规划[4]；A-MEM 通过结构化笔记及其关联组织记忆，使新增信息能够影响已有记忆的组织[5]。这些方法分别突出上下文调度、高层经验归纳和关联组织，为教育画像的跨会话延续提供了可借鉴的机制。</w:t>
       </w:r>
     </w:p>
     <w:p>
       <w:r>
-        <w:t>W3C PROV 为实体、活动、归属和派生关系提供通用描述框架[12]。LearnFlow 的标识链具有相近的可追溯目的，但本文不声称兼容 PROV 序列化标准。更关键的区别是：派生链能够说明观察从哪里来，却不能单独说明该观察是否仍适合当前动作。本文通过独立时序审计检查后一个问题。</w:t>
+        <w:t>不同表示同时引入不同的核验问题。摘要是否保留了例外条件，关联笔记是否保留了原始观察，候选检索是否让新近失败被更相关的旧成功替代，都需要在具体读取链路上检查。这是本文从教育证据需求提出的分析框架，不是对上述系统已经发生错误的断言。若只比较最终回答总分，形成、检索与预算裁剪造成的损失可能难以区分。</w:t>
+      </w:r>
+    </w:p>
+    <w:p>
+      <w:r>
+        <w:t>RAG 将检索到的外部信息接入生成过程[10]，但教材知识与学习者证据承担不同职责：前者支持内容正确性，后者约束对这个学习者的判断。本文的检索实现包含有界候选池内的 BM25 词法重排[11]，没有稠密语义候选通道。实验检查送达内容及确定性规划，不将其分数等同于生成质量，也未实际对比 MemGPT、A-MEM 或稠密检索等外部强基线。</w:t>
+      </w:r>
+    </w:p>
+    <w:p>
+      <w:pPr>
+        <w:pStyle w:val="Heading2"/>
+      </w:pPr>
+      <w:r>
+        <w:t>2.4 DeepTutor 的共享画像与个性化教学</w:t>
+      </w:r>
+    </w:p>
+    <w:p>
+      <w:r>
+        <w:t>Zhao 等的 DeepTutor 将知识库与动态记忆结合，服务解题和出题[16]。其 Trace Forest 保留会话、规划与执行层记录；记忆代理维护会话历史、弱点诊断和教学自我反思，并向不同角色注入相关画像。论文还描述了跨会话更新弱点状态的规则。因此，它与本文一样关注多功能共享且持续更新的学习者状态，不能被概括为静态 RAG 问答工具。</w:t>
+      </w:r>
+    </w:p>
+    <w:p>
+      <w:r>
+        <w:t>DeepTutor 的 TutorBench 包含 90 个画像和 270 个任务，采用模拟学生对话及独立模型评分。原文表 1 中，完整系统总体质量为 3.91/5，移除记忆后为 3.80/5[16]。这些是外部论文报告的评分，不是真实学生成绩，也未由本文复现。其消融关注整体教学输出；本文则进一步拆查来源、辅助条件和预算读取后的时序适用性。二者测量对象不同，目前不能判断谁的教育效果更好。</w:t>
+      </w:r>
+    </w:p>
+    <w:p>
+      <w:r>
+        <w:t>可直接借鉴的实验设计是将学习者背景、已有知识与误解明确写入任务，并让同一画像经历连续交互。对 LearnFlow，后续可以把这样的互动评价接在证据审计之后，检验时序一致的记忆是否实际改善解释和练习选择；但模拟器表现、教师判断与真实学生学习结果仍应分开报告。本文没有运行 TutorBench 或 DeepTutor 基线。</w:t>
+      </w:r>
+    </w:p>
+    <w:p>
+      <w:pPr>
+        <w:pStyle w:val="Heading2"/>
+      </w:pPr>
+      <w:r>
+        <w:t>2.5 从记忆检索到教育效果的评测层次</w:t>
+      </w:r>
+    </w:p>
+    <w:p>
+      <w:r>
+        <w:t>LoCoMo 评估长对话历史上的记忆任务[6]；LongMemEval 将知识更新和时间推理纳入长期记忆测量[7]；LoCoMo-Plus 关注隐含约束应用[8]，AMemGym 则引入具有状态演化的交互评估[9]。这些工作推动评测超越孤立事实匹配，但它们的任务定义、访问方式和评分单位不同。本文只运行了 LoCoMo 的来源证据检索适配，没有运行其官方答案评分或后三个基准，不能直接横比官方成绩。</w:t>
+      </w:r>
+    </w:p>
+    <w:p>
+      <w:r>
+        <w:t>来源溯源是另一条互补路径。W3C PROV 对实体、活动及派生关系给出通用描述[12]，为检查信息从何而来提供基础。本文的标识链具有相近目的，但没有实现 PROV 序列化兼容。由来源关系推断当前教学适用性还需要额外前提，例如观察的先后、任务范围及后续修正。因此，我们将来源检查与时序审计分别设置，并同时报告无评估动作的案例。</w:t>
+      </w:r>
+    </w:p>
+    <w:p>
+      <w:r>
+        <w:t>教育效果需要进一步的研究设计。Tutor CoPilot 为真人导师提供实时建议，并通过预注册随机对照研究检查真实辅导中的学习结果[17]。这展示了与日志验证和模拟对话不同的证据层次；其人机协同条件及学校数学场景也不能直接外推到计算机专业的自主学习。对 LearnFlow，应先完成独立教师评价，再根据拟主张的教育收益选择前后测、保持或迁移任务。软件执行正确、生成反馈适切和学习效果改善，不能互相替代。</w:t>
+      </w:r>
+    </w:p>
+    <w:p>
+      <w:pPr>
+        <w:pStyle w:val="Heading2"/>
+      </w:pPr>
+      <w:r>
+        <w:t>2.6 比较与本文的研究位置</w:t>
+      </w:r>
+    </w:p>
+    <w:p>
+      <w:r>
+        <w:t>表 1 按研究路径比较代表工作。表中的边界描述所引研究的主要测量范围，不把未报告项目当成缺失功能，也不将本文尚未验证的设计列为性能优势。</w:t>
+      </w:r>
+    </w:p>
+    <w:p>
+      <w:pPr>
+        <w:pStyle w:val="Caption"/>
+        <w:keepNext/>
+      </w:pPr>
+      <w:r>
+        <w:rPr>
+          <w:b/>
+        </w:rPr>
+        <w:t>表 1 代表研究的对象、机制与证据边界</w:t>
+      </w:r>
+    </w:p>
+    <w:tbl>
+      <w:tblPr>
+        <w:tblW w:type="auto" w:w="0"/>
+        <w:jc w:val="center"/>
+        <w:tblLayout w:type="fixed"/>
+        <w:tblLook w:firstColumn="1" w:firstRow="1" w:lastColumn="0" w:lastRow="0" w:noHBand="0" w:noVBand="1" w:val="04A0"/>
+        <w:tblBorders>
+          <w:top w:val="single" w:sz="8" w:color="333333"/>
+          <w:bottom w:val="single" w:sz="8" w:color="333333"/>
+          <w:left w:val="nil" w:sz="8" w:color="333333"/>
+          <w:right w:val="nil" w:sz="8" w:color="333333"/>
+          <w:insideH w:val="nil" w:sz="8" w:color="333333"/>
+          <w:insideV w:val="nil" w:sz="8" w:color="333333"/>
+        </w:tblBorders>
+      </w:tblPr>
+      <w:tblGrid>
+        <w:gridCol w:w="1814"/>
+        <w:gridCol w:w="2551"/>
+        <w:gridCol w:w="2608"/>
+        <w:gridCol w:w="2835"/>
+      </w:tblGrid>
+      <w:tr>
+        <w:trPr>
+          <w:cantSplit/>
+          <w:tblHeader/>
+        </w:trPr>
+        <w:tc>
+          <w:tcPr>
+            <w:tcW w:type="dxa" w:w="1814"/>
+            <w:vAlign w:val="center"/>
+            <w:tcBorders>
+              <w:bottom w:val="single" w:sz="4" w:color="777777"/>
+            </w:tcBorders>
+          </w:tcPr>
+          <w:p>
+            <w:pPr>
+              <w:spacing w:before="60" w:after="60" w:line="250" w:lineRule="auto"/>
+              <w:ind w:firstLine="0"/>
+              <w:jc w:val="left"/>
+            </w:pPr>
+            <w:r>
+              <w:rPr>
+                <w:b/>
+                <w:sz w:val="18"/>
+              </w:rPr>
+              <w:t>研究路径</w:t>
+            </w:r>
+          </w:p>
+        </w:tc>
+        <w:tc>
+          <w:tcPr>
+            <w:tcW w:type="dxa" w:w="2551"/>
+            <w:vAlign w:val="center"/>
+            <w:tcBorders>
+              <w:bottom w:val="single" w:sz="4" w:color="777777"/>
+            </w:tcBorders>
+          </w:tcPr>
+          <w:p>
+            <w:pPr>
+              <w:spacing w:before="60" w:after="60" w:line="250" w:lineRule="auto"/>
+              <w:ind w:firstLine="0"/>
+              <w:jc w:val="left"/>
+            </w:pPr>
+            <w:r>
+              <w:rPr>
+                <w:b/>
+                <w:sz w:val="18"/>
+              </w:rPr>
+              <w:t>主要研究对象</w:t>
+            </w:r>
+          </w:p>
+        </w:tc>
+        <w:tc>
+          <w:tcPr>
+            <w:tcW w:type="dxa" w:w="2608"/>
+            <w:vAlign w:val="center"/>
+            <w:tcBorders>
+              <w:bottom w:val="single" w:sz="4" w:color="777777"/>
+            </w:tcBorders>
+          </w:tcPr>
+          <w:p>
+            <w:pPr>
+              <w:spacing w:before="60" w:after="60" w:line="250" w:lineRule="auto"/>
+              <w:ind w:firstLine="0"/>
+              <w:jc w:val="left"/>
+            </w:pPr>
+            <w:r>
+              <w:rPr>
+                <w:b/>
+                <w:sz w:val="18"/>
+              </w:rPr>
+              <w:t>表示或更新机制</w:t>
+            </w:r>
+          </w:p>
+        </w:tc>
+        <w:tc>
+          <w:tcPr>
+            <w:tcW w:type="dxa" w:w="2835"/>
+            <w:vAlign w:val="center"/>
+            <w:tcBorders>
+              <w:bottom w:val="single" w:sz="4" w:color="777777"/>
+            </w:tcBorders>
+          </w:tcPr>
+          <w:p>
+            <w:pPr>
+              <w:spacing w:before="60" w:after="60" w:line="250" w:lineRule="auto"/>
+              <w:ind w:firstLine="0"/>
+              <w:jc w:val="left"/>
+            </w:pPr>
+            <w:r>
+              <w:rPr>
+                <w:b/>
+                <w:sz w:val="18"/>
+              </w:rPr>
+              <w:t>与本文比较的边界</w:t>
+            </w:r>
+          </w:p>
+        </w:tc>
+      </w:tr>
+      <w:tr>
+        <w:trPr>
+          <w:cantSplit/>
+        </w:trPr>
+        <w:tc>
+          <w:tcPr>
+            <w:tcW w:type="dxa" w:w="1814"/>
+            <w:vAlign w:val="center"/>
+          </w:tcPr>
+          <w:p>
+            <w:pPr>
+              <w:spacing w:before="60" w:after="60" w:line="250" w:lineRule="auto"/>
+              <w:ind w:firstLine="0"/>
+              <w:jc w:val="left"/>
+            </w:pPr>
+            <w:r>
+              <w:rPr>
+                <w:b w:val="0"/>
+                <w:sz w:val="18"/>
+              </w:rPr>
+              <w:t>知识追踪[1,2]</w:t>
+            </w:r>
+          </w:p>
+        </w:tc>
+        <w:tc>
+          <w:tcPr>
+            <w:tcW w:type="dxa" w:w="2551"/>
+            <w:vAlign w:val="center"/>
+          </w:tcPr>
+          <w:p>
+            <w:pPr>
+              <w:spacing w:before="60" w:after="60" w:line="250" w:lineRule="auto"/>
+              <w:ind w:firstLine="0"/>
+              <w:jc w:val="left"/>
+            </w:pPr>
+            <w:r>
+              <w:rPr>
+                <w:b w:val="0"/>
+                <w:sz w:val="18"/>
+              </w:rPr>
+              <w:t>练习序列中的知识状态</w:t>
+            </w:r>
+          </w:p>
+        </w:tc>
+        <w:tc>
+          <w:tcPr>
+            <w:tcW w:type="dxa" w:w="2608"/>
+            <w:vAlign w:val="center"/>
+          </w:tcPr>
+          <w:p>
+            <w:pPr>
+              <w:spacing w:before="60" w:after="60" w:line="250" w:lineRule="auto"/>
+              <w:ind w:firstLine="0"/>
+              <w:jc w:val="left"/>
+            </w:pPr>
+            <w:r>
+              <w:rPr>
+                <w:b w:val="0"/>
+                <w:sz w:val="18"/>
+              </w:rPr>
+              <w:t>概率状态或序列表示随表现更新</w:t>
+            </w:r>
+          </w:p>
+        </w:tc>
+        <w:tc>
+          <w:tcPr>
+            <w:tcW w:type="dxa" w:w="2835"/>
+            <w:vAlign w:val="center"/>
+          </w:tcPr>
+          <w:p>
+            <w:pPr>
+              <w:spacing w:before="60" w:after="60" w:line="250" w:lineRule="auto"/>
+              <w:ind w:firstLine="0"/>
+              <w:jc w:val="left"/>
+            </w:pPr>
+            <w:r>
+              <w:rPr>
+                <w:b w:val="0"/>
+                <w:sz w:val="18"/>
+              </w:rPr>
+              <w:t>状态预测不能直接验证上下文证据是否完整送达</w:t>
+            </w:r>
+          </w:p>
+        </w:tc>
+      </w:tr>
+      <w:tr>
+        <w:trPr>
+          <w:cantSplit/>
+        </w:trPr>
+        <w:tc>
+          <w:tcPr>
+            <w:tcW w:type="dxa" w:w="1814"/>
+            <w:vAlign w:val="center"/>
+          </w:tcPr>
+          <w:p>
+            <w:pPr>
+              <w:spacing w:before="60" w:after="60" w:line="250" w:lineRule="auto"/>
+              <w:ind w:firstLine="0"/>
+              <w:jc w:val="left"/>
+            </w:pPr>
+            <w:r>
+              <w:rPr>
+                <w:b w:val="0"/>
+                <w:sz w:val="18"/>
+              </w:rPr>
+              <w:t>开放学习者模型[14,18]</w:t>
+            </w:r>
+          </w:p>
+        </w:tc>
+        <w:tc>
+          <w:tcPr>
+            <w:tcW w:type="dxa" w:w="2551"/>
+            <w:vAlign w:val="center"/>
+          </w:tcPr>
+          <w:p>
+            <w:pPr>
+              <w:spacing w:before="60" w:after="60" w:line="250" w:lineRule="auto"/>
+              <w:ind w:firstLine="0"/>
+              <w:jc w:val="left"/>
+            </w:pPr>
+            <w:r>
+              <w:rPr>
+                <w:b w:val="0"/>
+                <w:sz w:val="18"/>
+              </w:rPr>
+              <w:t>画像的可理解性与学习者参与</w:t>
+            </w:r>
+          </w:p>
+        </w:tc>
+        <w:tc>
+          <w:tcPr>
+            <w:tcW w:type="dxa" w:w="2608"/>
+            <w:vAlign w:val="center"/>
+          </w:tcPr>
+          <w:p>
+            <w:pPr>
+              <w:spacing w:before="60" w:after="60" w:line="250" w:lineRule="auto"/>
+              <w:ind w:firstLine="0"/>
+              <w:jc w:val="left"/>
+            </w:pPr>
+            <w:r>
+              <w:rPr>
+                <w:b w:val="0"/>
+                <w:sz w:val="18"/>
+              </w:rPr>
+              <w:t>公开学习信息，支持查看与提出修订</w:t>
+            </w:r>
+          </w:p>
+        </w:tc>
+        <w:tc>
+          <w:tcPr>
+            <w:tcW w:type="dxa" w:w="2835"/>
+            <w:vAlign w:val="center"/>
+          </w:tcPr>
+          <w:p>
+            <w:pPr>
+              <w:spacing w:before="60" w:after="60" w:line="250" w:lineRule="auto"/>
+              <w:ind w:firstLine="0"/>
+              <w:jc w:val="left"/>
+            </w:pPr>
+            <w:r>
+              <w:rPr>
+                <w:b w:val="0"/>
+                <w:sz w:val="18"/>
+              </w:rPr>
+              <w:t>本文未测量界面理解、修订效果及元认知收益</w:t>
+            </w:r>
+          </w:p>
+        </w:tc>
+      </w:tr>
+      <w:tr>
+        <w:trPr>
+          <w:cantSplit/>
+        </w:trPr>
+        <w:tc>
+          <w:tcPr>
+            <w:tcW w:type="dxa" w:w="1814"/>
+            <w:vAlign w:val="center"/>
+          </w:tcPr>
+          <w:p>
+            <w:pPr>
+              <w:spacing w:before="60" w:after="60" w:line="250" w:lineRule="auto"/>
+              <w:ind w:firstLine="0"/>
+              <w:jc w:val="left"/>
+            </w:pPr>
+            <w:r>
+              <w:rPr>
+                <w:b w:val="0"/>
+                <w:sz w:val="18"/>
+              </w:rPr>
+              <w:t>MemGPT[3]</w:t>
+            </w:r>
+          </w:p>
+        </w:tc>
+        <w:tc>
+          <w:tcPr>
+            <w:tcW w:type="dxa" w:w="2551"/>
+            <w:vAlign w:val="center"/>
+          </w:tcPr>
+          <w:p>
+            <w:pPr>
+              <w:spacing w:before="60" w:after="60" w:line="250" w:lineRule="auto"/>
+              <w:ind w:firstLine="0"/>
+              <w:jc w:val="left"/>
+            </w:pPr>
+            <w:r>
+              <w:rPr>
+                <w:b w:val="0"/>
+                <w:sz w:val="18"/>
+              </w:rPr>
+              <w:t>有限上下文下的长历史访问</w:t>
+            </w:r>
+          </w:p>
+        </w:tc>
+        <w:tc>
+          <w:tcPr>
+            <w:tcW w:type="dxa" w:w="2608"/>
+            <w:vAlign w:val="center"/>
+          </w:tcPr>
+          <w:p>
+            <w:pPr>
+              <w:spacing w:before="60" w:after="60" w:line="250" w:lineRule="auto"/>
+              <w:ind w:firstLine="0"/>
+              <w:jc w:val="left"/>
+            </w:pPr>
+            <w:r>
+              <w:rPr>
+                <w:b w:val="0"/>
+                <w:sz w:val="18"/>
+              </w:rPr>
+              <w:t>分层存储与上下文管理</w:t>
+            </w:r>
+          </w:p>
+        </w:tc>
+        <w:tc>
+          <w:tcPr>
+            <w:tcW w:type="dxa" w:w="2835"/>
+            <w:vAlign w:val="center"/>
+          </w:tcPr>
+          <w:p>
+            <w:pPr>
+              <w:spacing w:before="60" w:after="60" w:line="250" w:lineRule="auto"/>
+              <w:ind w:firstLine="0"/>
+              <w:jc w:val="left"/>
+            </w:pPr>
+            <w:r>
+              <w:rPr>
+                <w:b w:val="0"/>
+                <w:sz w:val="18"/>
+              </w:rPr>
+              <w:t>本文未在统一访问与预算下复现对照</w:t>
+            </w:r>
+          </w:p>
+        </w:tc>
+      </w:tr>
+      <w:tr>
+        <w:trPr>
+          <w:cantSplit/>
+        </w:trPr>
+        <w:tc>
+          <w:tcPr>
+            <w:tcW w:type="dxa" w:w="1814"/>
+            <w:vAlign w:val="center"/>
+          </w:tcPr>
+          <w:p>
+            <w:pPr>
+              <w:spacing w:before="60" w:after="60" w:line="250" w:lineRule="auto"/>
+              <w:ind w:firstLine="0"/>
+              <w:jc w:val="left"/>
+            </w:pPr>
+            <w:r>
+              <w:rPr>
+                <w:b w:val="0"/>
+                <w:sz w:val="18"/>
+              </w:rPr>
+              <w:t>Generative Agents 与 A-MEM[4,5]</w:t>
+            </w:r>
+          </w:p>
+        </w:tc>
+        <w:tc>
+          <w:tcPr>
+            <w:tcW w:type="dxa" w:w="2551"/>
+            <w:vAlign w:val="center"/>
+          </w:tcPr>
+          <w:p>
+            <w:pPr>
+              <w:spacing w:before="60" w:after="60" w:line="250" w:lineRule="auto"/>
+              <w:ind w:firstLine="0"/>
+              <w:jc w:val="left"/>
+            </w:pPr>
+            <w:r>
+              <w:rPr>
+                <w:b w:val="0"/>
+                <w:sz w:val="18"/>
+              </w:rPr>
+              <w:t>可检索经验及记忆关联</w:t>
+            </w:r>
+          </w:p>
+        </w:tc>
+        <w:tc>
+          <w:tcPr>
+            <w:tcW w:type="dxa" w:w="2608"/>
+            <w:vAlign w:val="center"/>
+          </w:tcPr>
+          <w:p>
+            <w:pPr>
+              <w:spacing w:before="60" w:after="60" w:line="250" w:lineRule="auto"/>
+              <w:ind w:firstLine="0"/>
+              <w:jc w:val="left"/>
+            </w:pPr>
+            <w:r>
+              <w:rPr>
+                <w:b w:val="0"/>
+                <w:sz w:val="18"/>
+              </w:rPr>
+              <w:t>观察反思或关联笔记</w:t>
+            </w:r>
+          </w:p>
+        </w:tc>
+        <w:tc>
+          <w:tcPr>
+            <w:tcW w:type="dxa" w:w="2835"/>
+            <w:vAlign w:val="center"/>
+          </w:tcPr>
+          <w:p>
+            <w:pPr>
+              <w:spacing w:before="60" w:after="60" w:line="250" w:lineRule="auto"/>
+              <w:ind w:firstLine="0"/>
+              <w:jc w:val="left"/>
+            </w:pPr>
+            <w:r>
+              <w:rPr>
+                <w:b w:val="0"/>
+                <w:sz w:val="18"/>
+              </w:rPr>
+              <w:t>需额外测量教育辅助条件及最新评估的送达</w:t>
+            </w:r>
+          </w:p>
+        </w:tc>
+      </w:tr>
+      <w:tr>
+        <w:trPr>
+          <w:cantSplit/>
+        </w:trPr>
+        <w:tc>
+          <w:tcPr>
+            <w:tcW w:type="dxa" w:w="1814"/>
+            <w:vAlign w:val="center"/>
+          </w:tcPr>
+          <w:p>
+            <w:pPr>
+              <w:spacing w:before="60" w:after="60" w:line="250" w:lineRule="auto"/>
+              <w:ind w:firstLine="0"/>
+              <w:jc w:val="left"/>
+            </w:pPr>
+            <w:r>
+              <w:rPr>
+                <w:b w:val="0"/>
+                <w:sz w:val="18"/>
+              </w:rPr>
+              <w:t>DeepTutor[16]</w:t>
+            </w:r>
+          </w:p>
+        </w:tc>
+        <w:tc>
+          <w:tcPr>
+            <w:tcW w:type="dxa" w:w="2551"/>
+            <w:vAlign w:val="center"/>
+          </w:tcPr>
+          <w:p>
+            <w:pPr>
+              <w:spacing w:before="60" w:after="60" w:line="250" w:lineRule="auto"/>
+              <w:ind w:firstLine="0"/>
+              <w:jc w:val="left"/>
+            </w:pPr>
+            <w:r>
+              <w:rPr>
+                <w:b w:val="0"/>
+                <w:sz w:val="18"/>
+              </w:rPr>
+              <w:t>共享画像驱动的个性化教学</w:t>
+            </w:r>
+          </w:p>
+        </w:tc>
+        <w:tc>
+          <w:tcPr>
+            <w:tcW w:type="dxa" w:w="2608"/>
+            <w:vAlign w:val="center"/>
+          </w:tcPr>
+          <w:p>
+            <w:pPr>
+              <w:spacing w:before="60" w:after="60" w:line="250" w:lineRule="auto"/>
+              <w:ind w:firstLine="0"/>
+              <w:jc w:val="left"/>
+            </w:pPr>
+            <w:r>
+              <w:rPr>
+                <w:b w:val="0"/>
+                <w:sz w:val="18"/>
+              </w:rPr>
+              <w:t>多层轨迹与画像更新</w:t>
+            </w:r>
+          </w:p>
+        </w:tc>
+        <w:tc>
+          <w:tcPr>
+            <w:tcW w:type="dxa" w:w="2835"/>
+            <w:vAlign w:val="center"/>
+          </w:tcPr>
+          <w:p>
+            <w:pPr>
+              <w:spacing w:before="60" w:after="60" w:line="250" w:lineRule="auto"/>
+              <w:ind w:firstLine="0"/>
+              <w:jc w:val="left"/>
+            </w:pPr>
+            <w:r>
+              <w:rPr>
+                <w:b w:val="0"/>
+                <w:sz w:val="18"/>
+              </w:rPr>
+              <w:t>模拟交互评分；本文未运行其系统或 TutorBench</w:t>
+            </w:r>
+          </w:p>
+        </w:tc>
+      </w:tr>
+      <w:tr>
+        <w:trPr>
+          <w:cantSplit/>
+        </w:trPr>
+        <w:tc>
+          <w:tcPr>
+            <w:tcW w:type="dxa" w:w="1814"/>
+            <w:vAlign w:val="center"/>
+          </w:tcPr>
+          <w:p>
+            <w:pPr>
+              <w:spacing w:before="60" w:after="60" w:line="250" w:lineRule="auto"/>
+              <w:ind w:firstLine="0"/>
+              <w:jc w:val="left"/>
+            </w:pPr>
+            <w:r>
+              <w:rPr>
+                <w:b w:val="0"/>
+                <w:sz w:val="18"/>
+              </w:rPr>
+              <w:t>Tutor CoPilot[17]</w:t>
+            </w:r>
+          </w:p>
+        </w:tc>
+        <w:tc>
+          <w:tcPr>
+            <w:tcW w:type="dxa" w:w="2551"/>
+            <w:vAlign w:val="center"/>
+          </w:tcPr>
+          <w:p>
+            <w:pPr>
+              <w:spacing w:before="60" w:after="60" w:line="250" w:lineRule="auto"/>
+              <w:ind w:firstLine="0"/>
+              <w:jc w:val="left"/>
+            </w:pPr>
+            <w:r>
+              <w:rPr>
+                <w:b w:val="0"/>
+                <w:sz w:val="18"/>
+              </w:rPr>
+              <w:t>真人导师获得 AI 支持后的教学</w:t>
+            </w:r>
+          </w:p>
+        </w:tc>
+        <w:tc>
+          <w:tcPr>
+            <w:tcW w:type="dxa" w:w="2608"/>
+            <w:vAlign w:val="center"/>
+          </w:tcPr>
+          <w:p>
+            <w:pPr>
+              <w:spacing w:before="60" w:after="60" w:line="250" w:lineRule="auto"/>
+              <w:ind w:firstLine="0"/>
+              <w:jc w:val="left"/>
+            </w:pPr>
+            <w:r>
+              <w:rPr>
+                <w:b w:val="0"/>
+                <w:sz w:val="18"/>
+              </w:rPr>
+              <w:t>根据当前辅导上下文提供建议</w:t>
+            </w:r>
+          </w:p>
+        </w:tc>
+        <w:tc>
+          <w:tcPr>
+            <w:tcW w:type="dxa" w:w="2835"/>
+            <w:vAlign w:val="center"/>
+          </w:tcPr>
+          <w:p>
+            <w:pPr>
+              <w:spacing w:before="60" w:after="60" w:line="250" w:lineRule="auto"/>
+              <w:ind w:firstLine="0"/>
+              <w:jc w:val="left"/>
+            </w:pPr>
+            <w:r>
+              <w:rPr>
+                <w:b w:val="0"/>
+                <w:sz w:val="18"/>
+              </w:rPr>
+              <w:t>真实随机对照证据，干预对象与本文不同</w:t>
+            </w:r>
+          </w:p>
+        </w:tc>
+      </w:tr>
+      <w:tr>
+        <w:trPr>
+          <w:cantSplit/>
+        </w:trPr>
+        <w:tc>
+          <w:tcPr>
+            <w:tcW w:type="dxa" w:w="1814"/>
+            <w:vAlign w:val="center"/>
+          </w:tcPr>
+          <w:p>
+            <w:pPr>
+              <w:spacing w:before="60" w:after="60" w:line="250" w:lineRule="auto"/>
+              <w:ind w:firstLine="0"/>
+              <w:jc w:val="left"/>
+            </w:pPr>
+            <w:r>
+              <w:rPr>
+                <w:b w:val="0"/>
+                <w:sz w:val="18"/>
+              </w:rPr>
+              <w:t>LearnFlow 本文</w:t>
+            </w:r>
+          </w:p>
+        </w:tc>
+        <w:tc>
+          <w:tcPr>
+            <w:tcW w:type="dxa" w:w="2551"/>
+            <w:vAlign w:val="center"/>
+          </w:tcPr>
+          <w:p>
+            <w:pPr>
+              <w:spacing w:before="60" w:after="60" w:line="250" w:lineRule="auto"/>
+              <w:ind w:firstLine="0"/>
+              <w:jc w:val="left"/>
+            </w:pPr>
+            <w:r>
+              <w:rPr>
+                <w:b w:val="0"/>
+                <w:sz w:val="18"/>
+              </w:rPr>
+              <w:t>学习证据的来源与时序适用性</w:t>
+            </w:r>
+          </w:p>
+        </w:tc>
+        <w:tc>
+          <w:tcPr>
+            <w:tcW w:type="dxa" w:w="2608"/>
+            <w:vAlign w:val="center"/>
+          </w:tcPr>
+          <w:p>
+            <w:pPr>
+              <w:spacing w:before="60" w:after="60" w:line="250" w:lineRule="auto"/>
+              <w:ind w:firstLine="0"/>
+              <w:jc w:val="left"/>
+            </w:pPr>
+            <w:r>
+              <w:rPr>
+                <w:b w:val="0"/>
+                <w:sz w:val="18"/>
+              </w:rPr>
+              <w:t>确定性归约、片段和预算准入</w:t>
+            </w:r>
+          </w:p>
+        </w:tc>
+        <w:tc>
+          <w:tcPr>
+            <w:tcW w:type="dxa" w:w="2835"/>
+            <w:vAlign w:val="center"/>
+          </w:tcPr>
+          <w:p>
+            <w:pPr>
+              <w:spacing w:before="60" w:after="60" w:line="250" w:lineRule="auto"/>
+              <w:ind w:firstLine="0"/>
+              <w:jc w:val="left"/>
+            </w:pPr>
+            <w:r>
+              <w:rPr>
+                <w:b w:val="0"/>
+                <w:sz w:val="18"/>
+              </w:rPr>
+              <w:t>合成轨迹与检索适配；未证明真实学习收益</w:t>
+            </w:r>
+          </w:p>
+        </w:tc>
+      </w:tr>
+    </w:tbl>
+    <w:p>
+      <w:pPr>
+        <w:spacing w:after="0" w:line="60" w:lineRule="exact"/>
+      </w:pPr>
+    </w:p>
+    <w:p>
+      <w:r>
+        <w:t>综合上述工作，本文不把持久化画像、图结构或多智能体组合本身作为创新结论，而研究一个更具体的问题：在来源真实且状态可更新的系统中，预算读取是否仍保留了当前教学动作成立所需的条件。由此形成三个可检验的关注点：过程限定能否随证据一起送达，较旧观察是否取代最新适用评估，以及避免过时动作后是否损失动作覆盖。第 4 节将这些问题落实为配对干预与分轨指标；真实教学效果留作独立验证。</w:t>
       </w:r>
     </w:p>
     <w:p>
@@ -467,7 +1278,7 @@
     </w:p>
     <w:p>
       <w:r>
-        <w:t>教育轨与通用对话轨使用不同的形成方式、统计单位与目标。表 1 给出执行规模。合计 65,820 次执行来自相同案例/问题在不同条件下的重复读取，不等于 65,820 名独立学习者，也不增加独立任务族或对话的数量。正式评测不调用 LLM 或网络。</w:t>
+        <w:t>教育轨与通用对话轨使用不同的形成方式、统计单位与目标。表 2 给出执行规模。合计 65,820 次执行来自相同案例/问题在不同条件下的重复读取，不等于 65,820 名独立学习者，也不增加独立任务族或对话的数量。正式评测不调用 LLM 或网络。</w:t>
       </w:r>
     </w:p>
     <w:p>
@@ -479,7 +1290,7 @@
         <w:rPr>
           <w:b/>
         </w:rPr>
-        <w:t>表 1 两条评测路径的组成</w:t>
+        <w:t>表 2 两条评测路径的组成</w:t>
       </w:r>
     </w:p>
     <w:tbl>
@@ -1154,7 +1965,7 @@
     </w:p>
     <w:p>
       <w:r>
-        <w:t>各教育配置保留相同当前输入，读取相同的形成快照。表 2 给出实际干预语义。这些消融发生在读取端，不能隔离所有配置共享的控制解析器升级。组件“被启用”“命中候选”“被选入上下文”和“满足探针”分别记录；一个从未激活的机制不能据此获得有效性结论。</w:t>
+        <w:t>各教育配置保留相同当前输入，读取相同的形成快照。表 3 给出实际干预语义。这些消融发生在读取端，不能隔离所有配置共享的控制解析器升级。组件“被启用”“命中候选”“被选入上下文”和“满足探针”分别记录；一个从未激活的机制不能据此获得有效性结论。</w:t>
       </w:r>
     </w:p>
     <w:p>
@@ -1166,7 +1977,7 @@
         <w:rPr>
           <w:b/>
         </w:rPr>
-        <w:t>表 2 配置及其具体干预</w:t>
+        <w:t>表 3 配置及其具体干预</w:t>
       </w:r>
     </w:p>
     <w:tbl>
@@ -2174,7 +2985,7 @@
     </w:p>
     <w:p>
       <w:r>
-        <w:t>表 3 报告全部教育消融的主题/来源 Fact 探针结果。full 在两档预算下分别命中 1,407 和 1,725 个探针；移除片段后升至 1,640 和 1,793，分别增加 233 和 68 个。低预算 facts_only 也略高于 full。因此，本实验不支持“增加记忆层级能改善所有查询”的无条件判断。</w:t>
+        <w:t>表 4 报告全部教育消融的主题/来源 Fact 探针结果。full 在两档预算下分别命中 1,407 和 1,725 个探针；移除片段后升至 1,640 和 1,793，分别增加 233 和 68 个。低预算 facts_only 也略高于 full。因此，本实验不支持“增加记忆层级能改善所有查询”的无条件判断。</w:t>
       </w:r>
     </w:p>
     <w:p>
@@ -2186,7 +2997,7 @@
         <w:rPr>
           <w:b/>
         </w:rPr>
-        <w:t>表 3 教育主题及来源事实的送达结果</w:t>
+        <w:t>表 4 教育主题及来源事实的送达结果</w:t>
       </w:r>
     </w:p>
     <w:tbl>
@@ -2224,7 +3035,7 @@
           </w:tcPr>
           <w:p>
             <w:pPr>
-              <w:spacing w:before="60" w:after="60" w:line="250" w:lineRule="auto"/>
+              <w:spacing w:before="40" w:after="40" w:line="250" w:lineRule="auto"/>
               <w:ind w:firstLine="0"/>
               <w:jc w:val="left"/>
             </w:pPr>
@@ -2247,7 +3058,7 @@
           </w:tcPr>
           <w:p>
             <w:pPr>
-              <w:spacing w:before="60" w:after="60" w:line="250" w:lineRule="auto"/>
+              <w:spacing w:before="40" w:after="40" w:line="250" w:lineRule="auto"/>
               <w:ind w:firstLine="0"/>
               <w:jc w:val="center"/>
             </w:pPr>
@@ -2270,7 +3081,7 @@
           </w:tcPr>
           <w:p>
             <w:pPr>
-              <w:spacing w:before="60" w:after="60" w:line="250" w:lineRule="auto"/>
+              <w:spacing w:before="40" w:after="40" w:line="250" w:lineRule="auto"/>
               <w:ind w:firstLine="0"/>
               <w:jc w:val="center"/>
             </w:pPr>
@@ -2295,7 +3106,7 @@
           </w:tcPr>
           <w:p>
             <w:pPr>
-              <w:spacing w:before="60" w:after="60" w:line="250" w:lineRule="auto"/>
+              <w:spacing w:before="40" w:after="40" w:line="250" w:lineRule="auto"/>
               <w:ind w:firstLine="0"/>
               <w:jc w:val="left"/>
             </w:pPr>
@@ -2315,7 +3126,7 @@
           </w:tcPr>
           <w:p>
             <w:pPr>
-              <w:spacing w:before="60" w:after="60" w:line="250" w:lineRule="auto"/>
+              <w:spacing w:before="40" w:after="40" w:line="250" w:lineRule="auto"/>
               <w:ind w:firstLine="0"/>
               <w:jc w:val="center"/>
             </w:pPr>
@@ -2335,7 +3146,7 @@
           </w:tcPr>
           <w:p>
             <w:pPr>
-              <w:spacing w:before="60" w:after="60" w:line="250" w:lineRule="auto"/>
+              <w:spacing w:before="40" w:after="40" w:line="250" w:lineRule="auto"/>
               <w:ind w:firstLine="0"/>
               <w:jc w:val="center"/>
             </w:pPr>
@@ -2360,7 +3171,7 @@
           </w:tcPr>
           <w:p>
             <w:pPr>
-              <w:spacing w:before="60" w:after="60" w:line="250" w:lineRule="auto"/>
+              <w:spacing w:before="40" w:after="40" w:line="250" w:lineRule="auto"/>
               <w:ind w:firstLine="0"/>
               <w:jc w:val="left"/>
             </w:pPr>
@@ -2380,7 +3191,7 @@
           </w:tcPr>
           <w:p>
             <w:pPr>
-              <w:spacing w:before="60" w:after="60" w:line="250" w:lineRule="auto"/>
+              <w:spacing w:before="40" w:after="40" w:line="250" w:lineRule="auto"/>
               <w:ind w:firstLine="0"/>
               <w:jc w:val="center"/>
             </w:pPr>
@@ -2400,7 +3211,7 @@
           </w:tcPr>
           <w:p>
             <w:pPr>
-              <w:spacing w:before="60" w:after="60" w:line="250" w:lineRule="auto"/>
+              <w:spacing w:before="40" w:after="40" w:line="250" w:lineRule="auto"/>
               <w:ind w:firstLine="0"/>
               <w:jc w:val="center"/>
             </w:pPr>
@@ -2425,7 +3236,7 @@
           </w:tcPr>
           <w:p>
             <w:pPr>
-              <w:spacing w:before="60" w:after="60" w:line="250" w:lineRule="auto"/>
+              <w:spacing w:before="40" w:after="40" w:line="250" w:lineRule="auto"/>
               <w:ind w:firstLine="0"/>
               <w:jc w:val="left"/>
             </w:pPr>
@@ -2445,7 +3256,7 @@
           </w:tcPr>
           <w:p>
             <w:pPr>
-              <w:spacing w:before="60" w:after="60" w:line="250" w:lineRule="auto"/>
+              <w:spacing w:before="40" w:after="40" w:line="250" w:lineRule="auto"/>
               <w:ind w:firstLine="0"/>
               <w:jc w:val="center"/>
             </w:pPr>
@@ -2465,7 +3276,7 @@
           </w:tcPr>
           <w:p>
             <w:pPr>
-              <w:spacing w:before="60" w:after="60" w:line="250" w:lineRule="auto"/>
+              <w:spacing w:before="40" w:after="40" w:line="250" w:lineRule="auto"/>
               <w:ind w:firstLine="0"/>
               <w:jc w:val="center"/>
             </w:pPr>
@@ -2490,7 +3301,7 @@
           </w:tcPr>
           <w:p>
             <w:pPr>
-              <w:spacing w:before="60" w:after="60" w:line="250" w:lineRule="auto"/>
+              <w:spacing w:before="40" w:after="40" w:line="250" w:lineRule="auto"/>
               <w:ind w:firstLine="0"/>
               <w:jc w:val="left"/>
             </w:pPr>
@@ -2510,7 +3321,7 @@
           </w:tcPr>
           <w:p>
             <w:pPr>
-              <w:spacing w:before="60" w:after="60" w:line="250" w:lineRule="auto"/>
+              <w:spacing w:before="40" w:after="40" w:line="250" w:lineRule="auto"/>
               <w:ind w:firstLine="0"/>
               <w:jc w:val="center"/>
             </w:pPr>
@@ -2530,7 +3341,7 @@
           </w:tcPr>
           <w:p>
             <w:pPr>
-              <w:spacing w:before="60" w:after="60" w:line="250" w:lineRule="auto"/>
+              <w:spacing w:before="40" w:after="40" w:line="250" w:lineRule="auto"/>
               <w:ind w:firstLine="0"/>
               <w:jc w:val="center"/>
             </w:pPr>
@@ -2555,7 +3366,7 @@
           </w:tcPr>
           <w:p>
             <w:pPr>
-              <w:spacing w:before="60" w:after="60" w:line="250" w:lineRule="auto"/>
+              <w:spacing w:before="40" w:after="40" w:line="250" w:lineRule="auto"/>
               <w:ind w:firstLine="0"/>
               <w:jc w:val="left"/>
             </w:pPr>
@@ -2575,7 +3386,7 @@
           </w:tcPr>
           <w:p>
             <w:pPr>
-              <w:spacing w:before="60" w:after="60" w:line="250" w:lineRule="auto"/>
+              <w:spacing w:before="40" w:after="40" w:line="250" w:lineRule="auto"/>
               <w:ind w:firstLine="0"/>
               <w:jc w:val="center"/>
             </w:pPr>
@@ -2595,7 +3406,7 @@
           </w:tcPr>
           <w:p>
             <w:pPr>
-              <w:spacing w:before="60" w:after="60" w:line="250" w:lineRule="auto"/>
+              <w:spacing w:before="40" w:after="40" w:line="250" w:lineRule="auto"/>
               <w:ind w:firstLine="0"/>
               <w:jc w:val="center"/>
             </w:pPr>
@@ -2620,7 +3431,7 @@
           </w:tcPr>
           <w:p>
             <w:pPr>
-              <w:spacing w:before="60" w:after="60" w:line="250" w:lineRule="auto"/>
+              <w:spacing w:before="40" w:after="40" w:line="250" w:lineRule="auto"/>
               <w:ind w:firstLine="0"/>
               <w:jc w:val="left"/>
             </w:pPr>
@@ -2640,7 +3451,7 @@
           </w:tcPr>
           <w:p>
             <w:pPr>
-              <w:spacing w:before="60" w:after="60" w:line="250" w:lineRule="auto"/>
+              <w:spacing w:before="40" w:after="40" w:line="250" w:lineRule="auto"/>
               <w:ind w:firstLine="0"/>
               <w:jc w:val="center"/>
             </w:pPr>
@@ -2660,7 +3471,7 @@
           </w:tcPr>
           <w:p>
             <w:pPr>
-              <w:spacing w:before="60" w:after="60" w:line="250" w:lineRule="auto"/>
+              <w:spacing w:before="40" w:after="40" w:line="250" w:lineRule="auto"/>
               <w:ind w:firstLine="0"/>
               <w:jc w:val="center"/>
             </w:pPr>
@@ -2685,7 +3496,7 @@
           </w:tcPr>
           <w:p>
             <w:pPr>
-              <w:spacing w:before="60" w:after="60" w:line="250" w:lineRule="auto"/>
+              <w:spacing w:before="40" w:after="40" w:line="250" w:lineRule="auto"/>
               <w:ind w:firstLine="0"/>
               <w:jc w:val="left"/>
             </w:pPr>
@@ -2705,7 +3516,7 @@
           </w:tcPr>
           <w:p>
             <w:pPr>
-              <w:spacing w:before="60" w:after="60" w:line="250" w:lineRule="auto"/>
+              <w:spacing w:before="40" w:after="40" w:line="250" w:lineRule="auto"/>
               <w:ind w:firstLine="0"/>
               <w:jc w:val="center"/>
             </w:pPr>
@@ -2725,7 +3536,7 @@
           </w:tcPr>
           <w:p>
             <w:pPr>
-              <w:spacing w:before="60" w:after="60" w:line="250" w:lineRule="auto"/>
+              <w:spacing w:before="40" w:after="40" w:line="250" w:lineRule="auto"/>
               <w:ind w:firstLine="0"/>
               <w:jc w:val="center"/>
             </w:pPr>
@@ -2750,7 +3561,7 @@
           </w:tcPr>
           <w:p>
             <w:pPr>
-              <w:spacing w:before="60" w:after="60" w:line="250" w:lineRule="auto"/>
+              <w:spacing w:before="40" w:after="40" w:line="250" w:lineRule="auto"/>
               <w:ind w:firstLine="0"/>
               <w:jc w:val="left"/>
             </w:pPr>
@@ -2770,7 +3581,7 @@
           </w:tcPr>
           <w:p>
             <w:pPr>
-              <w:spacing w:before="60" w:after="60" w:line="250" w:lineRule="auto"/>
+              <w:spacing w:before="40" w:after="40" w:line="250" w:lineRule="auto"/>
               <w:ind w:firstLine="0"/>
               <w:jc w:val="center"/>
             </w:pPr>
@@ -2790,7 +3601,7 @@
           </w:tcPr>
           <w:p>
             <w:pPr>
-              <w:spacing w:before="60" w:after="60" w:line="250" w:lineRule="auto"/>
+              <w:spacing w:before="40" w:after="40" w:line="250" w:lineRule="auto"/>
               <w:ind w:firstLine="0"/>
               <w:jc w:val="center"/>
             </w:pPr>
@@ -2815,7 +3626,7 @@
           </w:tcPr>
           <w:p>
             <w:pPr>
-              <w:spacing w:before="60" w:after="60" w:line="250" w:lineRule="auto"/>
+              <w:spacing w:before="40" w:after="40" w:line="250" w:lineRule="auto"/>
               <w:ind w:firstLine="0"/>
               <w:jc w:val="left"/>
             </w:pPr>
@@ -2835,7 +3646,7 @@
           </w:tcPr>
           <w:p>
             <w:pPr>
-              <w:spacing w:before="60" w:after="60" w:line="250" w:lineRule="auto"/>
+              <w:spacing w:before="40" w:after="40" w:line="250" w:lineRule="auto"/>
               <w:ind w:firstLine="0"/>
               <w:jc w:val="center"/>
             </w:pPr>
@@ -2855,7 +3666,7 @@
           </w:tcPr>
           <w:p>
             <w:pPr>
-              <w:spacing w:before="60" w:after="60" w:line="250" w:lineRule="auto"/>
+              <w:spacing w:before="40" w:after="40" w:line="250" w:lineRule="auto"/>
               <w:ind w:firstLine="0"/>
               <w:jc w:val="center"/>
             </w:pPr>
@@ -2880,7 +3691,7 @@
           </w:tcPr>
           <w:p>
             <w:pPr>
-              <w:spacing w:before="60" w:after="60" w:line="250" w:lineRule="auto"/>
+              <w:spacing w:before="40" w:after="40" w:line="250" w:lineRule="auto"/>
               <w:ind w:firstLine="0"/>
               <w:jc w:val="left"/>
             </w:pPr>
@@ -2900,7 +3711,7 @@
           </w:tcPr>
           <w:p>
             <w:pPr>
-              <w:spacing w:before="60" w:after="60" w:line="250" w:lineRule="auto"/>
+              <w:spacing w:before="40" w:after="40" w:line="250" w:lineRule="auto"/>
               <w:ind w:firstLine="0"/>
               <w:jc w:val="center"/>
             </w:pPr>
@@ -2920,7 +3731,7 @@
           </w:tcPr>
           <w:p>
             <w:pPr>
-              <w:spacing w:before="60" w:after="60" w:line="250" w:lineRule="auto"/>
+              <w:spacing w:before="40" w:after="40" w:line="250" w:lineRule="auto"/>
               <w:ind w:firstLine="0"/>
               <w:jc w:val="center"/>
             </w:pPr>
@@ -2945,7 +3756,7 @@
           </w:tcPr>
           <w:p>
             <w:pPr>
-              <w:spacing w:before="60" w:after="60" w:line="250" w:lineRule="auto"/>
+              <w:spacing w:before="40" w:after="40" w:line="250" w:lineRule="auto"/>
               <w:ind w:firstLine="0"/>
               <w:jc w:val="left"/>
             </w:pPr>
@@ -2965,7 +3776,7 @@
           </w:tcPr>
           <w:p>
             <w:pPr>
-              <w:spacing w:before="60" w:after="60" w:line="250" w:lineRule="auto"/>
+              <w:spacing w:before="40" w:after="40" w:line="250" w:lineRule="auto"/>
               <w:ind w:firstLine="0"/>
               <w:jc w:val="center"/>
             </w:pPr>
@@ -2985,7 +3796,7 @@
           </w:tcPr>
           <w:p>
             <w:pPr>
-              <w:spacing w:before="60" w:after="60" w:line="250" w:lineRule="auto"/>
+              <w:spacing w:before="40" w:after="40" w:line="250" w:lineRule="auto"/>
               <w:ind w:firstLine="0"/>
               <w:jc w:val="center"/>
             </w:pPr>
@@ -3010,7 +3821,7 @@
           </w:tcPr>
           <w:p>
             <w:pPr>
-              <w:spacing w:before="60" w:after="60" w:line="250" w:lineRule="auto"/>
+              <w:spacing w:before="40" w:after="40" w:line="250" w:lineRule="auto"/>
               <w:ind w:firstLine="0"/>
               <w:jc w:val="left"/>
             </w:pPr>
@@ -3030,7 +3841,7 @@
           </w:tcPr>
           <w:p>
             <w:pPr>
-              <w:spacing w:before="60" w:after="60" w:line="250" w:lineRule="auto"/>
+              <w:spacing w:before="40" w:after="40" w:line="250" w:lineRule="auto"/>
               <w:ind w:firstLine="0"/>
               <w:jc w:val="center"/>
             </w:pPr>
@@ -3050,7 +3861,7 @@
           </w:tcPr>
           <w:p>
             <w:pPr>
-              <w:spacing w:before="60" w:after="60" w:line="250" w:lineRule="auto"/>
+              <w:spacing w:before="40" w:after="40" w:line="250" w:lineRule="auto"/>
               <w:ind w:firstLine="0"/>
               <w:jc w:val="center"/>
             </w:pPr>
@@ -3072,7 +3883,7 @@
     </w:p>
     <w:p>
       <w:r>
-        <w:t>各配置在两档预算下的原始陈述送达均为 0/1,152，未计入表 3 的分子。其目标事件没有形成对应 MemoryFact，属于从上游形成到下游送达的断点。调整重排不能恢复从未进入可检索事实层的目标。这也说明弱主题探针的较高命中不能替代原文覆盖检查。</w:t>
+        <w:t>各配置在两档预算下的原始陈述送达均为 0/1,152，未计入表 4 的分子。其目标事件没有形成对应 MemoryFact，属于从上游形成到下游送达的断点。调整重排不能恢复从未进入可检索事实层的目标。这也说明弱主题探针的较高命中不能替代原文覆盖检查。</w:t>
       </w:r>
     </w:p>
     <w:p>
@@ -3162,7 +3973,7 @@
         <w:rPr>
           <w:b/>
         </w:rPr>
-        <w:t>表 4 LoCoMo 主类别的证据检索结果</w:t>
+        <w:t>表 5 LoCoMo 主类别的证据检索结果</w:t>
       </w:r>
     </w:p>
     <w:tbl>
@@ -4437,6 +5248,66 @@
         <w:t>[13] LearnFlow project repository, product snapshot 0da6615eeb2a5dded4101535e8534cd5494b43a9, 2026. https://github.com/runzhong123-max/LearnFlow/tree/0da6615eeb2a5dded4101535e8534cd5494b43a9/evals/education_memory_v2</w:t>
       </w:r>
     </w:p>
+    <w:p>
+      <w:pPr>
+        <w:spacing w:line="252" w:lineRule="auto" w:after="120"/>
+        <w:ind w:firstLine="0"/>
+      </w:pPr>
+      <w:r>
+        <w:rPr>
+          <w:sz w:val="18"/>
+        </w:rPr>
+        <w:t>[14] S. Bull and J. Kay, “SMILI: a Framework for Interfaces to Learning Data in Open Learner Models, Learning Analytics and Related Fields,” International Journal of Artificial Intelligence in Education, vol. 26, pp. 293–331, 2016. https://doi.org/10.1007/s40593-015-0090-8</w:t>
+      </w:r>
+    </w:p>
+    <w:p>
+      <w:pPr>
+        <w:spacing w:line="252" w:lineRule="auto" w:after="120"/>
+        <w:ind w:firstLine="0"/>
+      </w:pPr>
+      <w:r>
+        <w:rPr>
+          <w:sz w:val="18"/>
+        </w:rPr>
+        <w:t>[15] K. R. Koedinger and V. Aleven, “Exploring the Assistance Dilemma in Experiments with Cognitive Tutors,” Educational Psychology Review, vol. 19, pp. 239–264, 2007. https://doi.org/10.1007/s10648-007-9049-0</w:t>
+      </w:r>
+    </w:p>
+    <w:p>
+      <w:pPr>
+        <w:spacing w:line="252" w:lineRule="auto" w:after="120"/>
+        <w:ind w:firstLine="0"/>
+      </w:pPr>
+      <w:r>
+        <w:rPr>
+          <w:sz w:val="18"/>
+        </w:rPr>
+        <w:t>[16] B. Zhao, J. Zhang, X. Ren, Z. Guo, T. Chu, Y. Ma, and C. Huang, “DeepTutor: Towards Agentic Personalized Tutoring,” arXiv:2604.26962v1, 2026. https://arxiv.org/abs/2604.26962v1</w:t>
+      </w:r>
+    </w:p>
+    <w:p>
+      <w:pPr>
+        <w:spacing w:line="252" w:lineRule="auto" w:after="120"/>
+        <w:ind w:firstLine="0"/>
+      </w:pPr>
+      <w:r>
+        <w:rPr>
+          <w:sz w:val="18"/>
+        </w:rPr>
+        <w:t>[17] R. E. Wang, A. T. Ribeiro, C. D. Robinson, S. Loeb, and D. Demszky, “Tutor CoPilot: A Human-AI Approach for Scaling Real-Time Expertise,” arXiv:2410.03017v2, 2025. https://arxiv.org/abs/2410.03017v2</w:t>
+      </w:r>
+    </w:p>
+    <w:p>
+      <w:pPr>
+        <w:spacing w:line="252" w:lineRule="auto" w:after="120"/>
+        <w:ind w:firstLine="0"/>
+      </w:pPr>
+      <w:r>
+        <w:rPr>
+          <w:sz w:val="18"/>
+        </w:rPr>
+        <w:t>[18] S. Bull, B. Ginon, C. Boscolo, and M. Johnson, “Introduction of learning visualisations and metacognitive support in a persuadable open learner model,” Proceedings of the Sixth International Conference on Learning Analytics &amp; Knowledge, pp. 30–39, 2016. https://doi.org/10.1145/2883851.2883853</w:t>
+      </w:r>
+    </w:p>
     <w:sectPr>
       <w:footerReference w:type="default" r:id="rId9"/>
       <w:pgSz w:w="11906" w:h="16838"/>

</xml_diff>

<commit_message>
docs: reframe paper around evidence-driven learner memory
</commit_message>
<xml_diff>
--- a/docs/research/education-memory-v2-paper/LearnFlow_Educational_Memory_Manuscript_ZH.docx
+++ b/docs/research/education-memory-v2-paper/LearnFlow_Educational_Memory_Manuscript_ZH.docx
@@ -8,9 +8,9 @@
         <w:jc w:val="center"/>
       </w:pPr>
       <w:r>
-        <w:t>预算约束下教育智能体学习者记忆的</w:t>
+        <w:t>面向计算机专业教学的</w:t>
         <w:br/>
-        <w:t>时序有效性与证据覆盖</w:t>
+        <w:t>证据驱动学习者记忆</w:t>
       </w:r>
     </w:p>
     <w:p>
@@ -23,7 +23,7 @@
     </w:p>
     <w:p>
       <w:r>
-        <w:t>教育智能体的学习者画像需要保留表现证据的发生时间、辅助条件与适用范围。然而，来源正确的历史记录在进入有限上下文后，仍可能支持已经过时的教学决策。针对这一问题，本文以服务计算机专业群的 LearnFlow 系统为对象，研究确定性事件归约、带来源学习片段与预算受限读取之间的关系。实验采用两条互补路径：在 1,584 条合成教育轨迹上执行 12 种配置和 2 档预算，在 LoCoMo 对话证据检索适配集上执行 7 种配置和 2 档预算，共形成 65,820 次条件执行。事后时序审计发现，低预算完整系统中有 192 个案例引用了较旧的评估证据。采用按事件时间排序的连续前缀准入后，63 个案例转为时序一致的评估动作，129 个转为无评估动作，揭示了时序一致性与动作覆盖之间的权衡。移除学习片段使低预算主题证据命中由 1,407/1,794 提高至 1,640/1,794，但同时消除了基于评估证据的动作。对 1,438 个有效 LoCoMo 主类别问题，完整系统两档预算的平均证据召回率分别为 48.81% 和 58.00%，移除 BM25 后分别下降 3.60 和 3.67 个百分点。结果表明，来源有效性、时序适用性和证据覆盖应分别评估。教育案例均已被作者查看，独立教师评审尚未完成，本文不据此推断真实学习收益或生成答案准确率。</w:t>
+        <w:t>教育智能体需要将持续积累的学习记录转化为可解释、可更新并能支持教学动作的学习者画像。为保留“学了什么”“在何种辅助下完成”以及“当前证据支持哪一步教学”之间的联系，本文介绍服务计算机专业群的 LearnFlow 记忆系统。系统以统一事件归约链维护五维学习者状态，将表现结果、辅助条件、时间和来源组织为学习片段，再通过受预算约束的只读投影支持确定性教学动作。研究采用教育原生证据形成与通用对话检索两条评测路径：1,584 条合成教育轨迹的 12 种配置和 2 档预算，以及 LoCoMo 适配集的 7 种配置和 2 档预算，共形成 65,820 次条件执行。教育轨表明，紧凑事实的主题覆盖与可用于教学的过程证据具有不同作用：移除片段使低预算主题命中由 1,407/1,794 升至 1,640/1,794，却使基于评估证据的动作全部消失。时序审计进一步发现 192 个引用旧评估的案例；连续前缀准入使其中 63 个转为一致动作，129 个转为无评估动作。独立的默认预算补充运行产生 1,311 个时序一致评估动作，273 个案例无适用评估。对 1,438 个有效 LoCoMo 主类别问题，完整系统两档预算的平均证据召回率为 48.81% 和 58.00%，移除 BM25 后下降 3.60 和 3.67 个百分点。结果支持在当前实现中联合检查证据送达、表现条件和教学动作来源，而非仅以事实召回评价画像。教育案例均已被作者查看，独立教师评审尚未完成；本文未证明真实学习收益或生成答案准确率。</w:t>
       </w:r>
     </w:p>
     <w:p>
@@ -59,12 +59,17 @@
     </w:p>
     <w:p>
       <w:r>
-        <w:t>LearnFlow 将学习者画像组织为结构、知识、人因、价值和实践五个状态维度，并通过统一的确定性证据链维护。本文发现的失效发生在读取端：较早的独立成功片段可能比之后的受助或失败片段更短；在预算紧张时，系统跳过较长的新片段而保留较短的旧片段。旧片段的来源标识均为真实记录，但由此生成的教学动作已经不符合最新适用评估。</w:t>
+        <w:t>LearnFlow 围绕这一需求构建证据驱动的学习者记忆。结构、知识、人因、价值和实践五个维度提供共同的画像组织方式；统一事件归约链规定哪些观察能够改变状态；带来源的学习片段保留任务结果及其辅助条件；读取端将当前适用证据交给教学规则。其目标是使画像中的判断能够追溯到学习行为，并使教学动作能够说明依据，而不是将一次交互压缩为脱离条件的能力标签。五维组织是本系统的工程设计，本文不预设它优于其他学习者模型。</w:t>
       </w:r>
     </w:p>
     <w:p>
       <w:r>
-        <w:t>围绕这一失效，本文给出三项工作。首先，明确学习者状态形成与预算受限读取的实现边界，说明来源、辅助等级和时序条件如何随证据传递。其次，通过配对执行与独立的事后审计，量化连续前缀准入对过时动作及动作覆盖的影响。最后，将教育原生证据形成与通用对话检索分轨评估，完整报告消融结果、未激活机制和未验证能力。本文的贡献在于系统集成、可审计失效分析及其经验结果，不将事件归约、BM25 或时间排序本身宣称为新算法。</w:t>
+        <w:t>本文的工作分为三个层次。第一，给出学习观察、状态形成和教学读取之间的统一实现，明确长期画像的写入权威与表现证据的使用条件。第二，以教育消融检验事实检索、学习片段和历史控制在教学准备中的不同职责，联合报告主题覆盖与评估动作，避免把“记住知识点”直接等同于“具备教学依据”。第三，通过时序配对审计及通用对话检索检验这一实现的适用范围，揭示预算裁剪、证据形成和多跳检索的具体缺口。本文贡献属于面向教育的系统设计及可复核的经验分析，不将事件归约、BM25 或时间排序本身宣称为新算法。</w:t>
+      </w:r>
+    </w:p>
+    <w:p>
+      <w:r>
+        <w:t>全文围绕一个核心问题展开：持续学习记录经过画像形成与有限上下文读取后，是否仍能为下一步教学提供带条件、可追溯的依据。预算导致的旧证据替代是检验这一目标的压力案例；它揭示系统的改进需求，但不替代对学习者记忆整体职责的讨论。</w:t>
       </w:r>
     </w:p>
     <w:p>
@@ -884,7 +889,7 @@
                 <w:b w:val="0"/>
                 <w:sz w:val="18"/>
               </w:rPr>
-              <w:t>学习证据的来源与时序适用性</w:t>
+              <w:t>证据驱动的学习者画像与教学读取</w:t>
             </w:r>
           </w:p>
         </w:tc>
@@ -937,7 +942,7 @@
     </w:p>
     <w:p>
       <w:r>
-        <w:t>综合上述工作，本文不把持久化画像、图结构或多智能体组合本身作为创新结论，而研究一个更具体的问题：在来源真实且状态可更新的系统中，预算读取是否仍保留了当前教学动作成立所需的条件。由此形成三个可检验的关注点：过程限定能否随证据一起送达，较旧观察是否取代最新适用评估，以及避免过时动作后是否损失动作覆盖。第 4 节将这些问题落实为配对干预与分轨指标；真实教学效果留作独立验证。</w:t>
+        <w:t>综合上述工作，本文将研究定位于学习者建模与智能体记忆之间的证据接口：学习记录如何形成有共同权威的画像，表现限定如何随记忆送达，以及教学动作如何引用当前适用观察。与 DeepTutor 的讨论有助于明确共享画像及历史更新的相关研究背景，但本文没有统一复现对照，不能据此得出系统优劣结论。下文以可检查的实现说明设计，再用读取端消融衡量其中部分机制；画像可理解性、用户修订体验与真实教学收益需要另行验证。</w:t>
       </w:r>
     </w:p>
     <w:p>
@@ -946,6 +951,11 @@
       </w:pPr>
       <w:r>
         <w:t>3 系统与方法</w:t>
+      </w:r>
+    </w:p>
+    <w:p>
+      <w:r>
+        <w:t>系统设计依次处理三个问题：谁有权根据观察更新画像，哪些条件必须伴随表现记录保留，以及教学端如何在有限上下文中使用这些证据。写入链解决状态来源的一致性，学习片段解决表现含义的保留，预算准入与动作规则解决证据的实际使用。三者连接在同一链路上，但其效果必须分别测量，不能由架构完整性推定。</w:t>
       </w:r>
     </w:p>
     <w:p>
@@ -1031,7 +1041,7 @@
         <w:pStyle w:val="Heading2"/>
       </w:pPr>
       <w:r>
-        <w:t>3.2 带作用域的教学控制与学习片段</w:t>
+        <w:t>3.2 保留教学约束与表现条件的学习片段</w:t>
       </w:r>
     </w:p>
     <w:p>
@@ -1242,7 +1252,7 @@
         <w:pStyle w:val="Heading2"/>
       </w:pPr>
       <w:r>
-        <w:t>3.5 确定性教学动作</w:t>
+        <w:t>3.5 从学习证据到下一步教学动作</w:t>
       </w:r>
     </w:p>
     <w:p>
@@ -1273,7 +1283,7 @@
     </w:p>
     <w:p>
       <w:r>
-        <w:t>实验回答四个问题：RQ1，来源有效的预算受限记忆是否保留最新适用评估；RQ2，结构化片段如何影响主题证据与评估动作的覆盖；RQ3，在没有教育原生形成链时，哪些通用检索组件产生可测贡献；RQ4，弱指标和总体均值会掩盖哪些仍未解决的证据缺口。</w:t>
+        <w:t>实验将系统目标拆为四个可检验问题：RQ1，形成的学习证据与历史控制能否在既定规则下支持教学动作；RQ2，预算读取能否保留最新适用评估及其表现条件；RQ3，主题事实与结构化片段对证据覆盖和动作覆盖分别起何作用；RQ4，离开教育原生形成链后，通用检索组件有哪些可测贡献及剩余缺口。第 5.1 至 5.4 节依次报告对应结果。所有问题均针对当前实现与测试范围，不将规则执行直接解释为教学有效性。</w:t>
       </w:r>
     </w:p>
     <w:p>
@@ -2898,11 +2908,39 @@
       </w:r>
     </w:p>
     <w:p>
+      <w:r>
+        <w:t>本节先检查记忆能否参与教学准备，再检验时序适用性与表示粒度，最后报告通用检索表现。默认预算结果是单独的补充运行，完整消融仍以两档正式预算为准；两者不合并为同一比较。</w:t>
+      </w:r>
+    </w:p>
+    <w:p>
       <w:pPr>
         <w:pStyle w:val="Heading2"/>
       </w:pPr>
       <w:r>
-        <w:t>5.1 来源正确仍可能产生过时教学动作</w:t>
+        <w:t>5.1 学习证据与历史控制支持教学动作</w:t>
+      </w:r>
+    </w:p>
+    <w:p>
+      <w:r>
+        <w:t>所有配置在每档预算下都对 72/72 个相关案例应用当前十分钟指令。保留历史指导的配置对 72/72 个相关案例应用有效的历史十分钟约束，no_guidance 与 no_memory 则为 0/72。检查读取的是实际计划时长，说明历史控制可访问性影响规则执行，但不能隔离共享解析器的改动，也没有测量真实学习时间。</w:t>
+      </w:r>
+    </w:p>
+    <w:p>
+      <w:r>
+        <w:t>独立的预算 2,900 补充运行仅包含 full，覆盖相同 1,584 个案例。其结果为 1,311 个时序一致评估动作、273 个 NA、0 个过时或无效引用，主题证据为 1,725/1,794。全部 138 个最新失败案例得到引用新来源的诊断动作。动作类型包括 1,035 个独立变式、138 个辅助递减、138 个诊断及 144 个时间限制，时间限制可与评估动作同时出现。1,584 个独立预算检查均通过，未记录执行错误、联网尝试或来源漂移。</w:t>
+      </w:r>
+    </w:p>
+    <w:p>
+      <w:r>
+        <w:t>这一补充说明，在当前默认预算和固定案例中没有再次观察到低预算的失败证据遗漏，不能据此认定 2,900 是通用最小预算或成本最优点。本文没有密集预算扫描，也没有在该预算上重跑通用对话轨。</w:t>
+      </w:r>
+    </w:p>
+    <w:p>
+      <w:pPr>
+        <w:pStyle w:val="Heading2"/>
+      </w:pPr>
+      <w:r>
+        <w:t>5.2 当前教学动作需要最新适用证据</w:t>
       </w:r>
     </w:p>
     <w:p>
@@ -2980,7 +3018,7 @@
         <w:pStyle w:val="Heading2"/>
       </w:pPr>
       <w:r>
-        <w:t>5.2 学习片段与主题事实竞争预算</w:t>
+        <w:t>5.3 学习片段提供主题匹配之外的教学依据</w:t>
       </w:r>
     </w:p>
     <w:p>
@@ -3956,7 +3994,7 @@
         <w:pStyle w:val="Heading2"/>
       </w:pPr>
       <w:r>
-        <w:t>5.3 通用检索收益主要来自 BM25</w:t>
+        <w:t>5.4 通用记忆检索的可测贡献与边界</w:t>
       </w:r>
     </w:p>
     <w:p>
@@ -4927,29 +4965,6 @@
     </w:p>
     <w:p>
       <w:pPr>
-        <w:pStyle w:val="Heading2"/>
-      </w:pPr>
-      <w:r>
-        <w:t>5.4 教学控制与默认预算补充结果</w:t>
-      </w:r>
-    </w:p>
-    <w:p>
-      <w:r>
-        <w:t>所有配置在每档预算下都对 72/72 个相关案例应用当前十分钟指令。保留历史指导的配置对 72/72 个相关案例应用有效的历史十分钟约束，no_guidance 与 no_memory 则为 0/72。检查读取的是实际计划时长，说明历史控制可访问性影响规则执行，但不能隔离共享解析器的改动，也没有测量真实学习时间。</w:t>
-      </w:r>
-    </w:p>
-    <w:p>
-      <w:r>
-        <w:t>独立的预算 2,900 补充运行仅包含 full，覆盖相同 1,584 个案例。其结果为 1,311 个时序一致评估动作、273 个 NA、0 个过时或无效引用，主题证据为 1,725/1,794。全部 138 个最新失败案例得到引用新来源的诊断动作。动作类型包括 1,035 个独立变式、138 个辅助递减、138 个诊断及 144 个时间限制，时间限制可与评估动作同时出现。1,584 个独立预算检查均通过，未记录执行错误、联网尝试或来源漂移。</w:t>
-      </w:r>
-    </w:p>
-    <w:p>
-      <w:r>
-        <w:t>这一补充说明，在当前默认预算和固定案例中没有再次观察到低预算的失败证据遗漏，不能据此认定 2,900 是通用最小预算或成本最优点。本文没有密集预算扫描，也没有在该预算上重跑通用对话轨。</w:t>
-      </w:r>
-    </w:p>
-    <w:p>
-      <w:pPr>
         <w:pStyle w:val="Heading1"/>
       </w:pPr>
       <w:r>
@@ -4957,11 +4972,16 @@
       </w:r>
     </w:p>
     <w:p>
+      <w:r>
+        <w:t>本系统的特点体现在证据如何贯穿学习者画像与教学使用：统一归约维护共同状态，片段保留辅助与时间限定，动作记录保留其判断来源。这一组织方式使“为什么安排独立检查而非直接进阶”等决策前提成为可审计对象。现有实验直接支持片段在当前规划器中的作用、历史约束的延续以及时序准入的局部效果；它们没有分别证明五维划分、Module/Claim 层级或图结构的独立优势。论文的系统主张与性能主张应保持这一界限。</w:t>
+      </w:r>
+    </w:p>
+    <w:p>
       <w:pPr>
         <w:pStyle w:val="Heading2"/>
       </w:pPr>
       <w:r>
-        <w:t>6.1 来源溯源必须与适用性检查结合</w:t>
+        <w:t>6.1 可追溯画像需要保留判断的适用条件</w:t>
       </w:r>
     </w:p>
     <w:p>
@@ -4979,7 +4999,7 @@
         <w:pStyle w:val="Heading2"/>
       </w:pPr>
       <w:r>
-        <w:t>6.2 记忆粒度需要服务具体教学任务</w:t>
+        <w:t>6.2 教学用途决定记忆表示的价值</w:t>
       </w:r>
     </w:p>
     <w:p>
@@ -5063,7 +5083,12 @@
     </w:p>
     <w:p>
       <w:r>
-        <w:t>在本文评测的教育记忆系统中，来源正确的旧观察可能因预算准入而取代较新的适用评估，进而支持过时教学动作。最新优先的连续前缀策略消除了低预算下观察到的 192 个过时案例，但其中 129 个转为无评估动作。结构化片段同时与紧凑主题事实竞争预算，移除片段提高主题覆盖却消除评估动作。独立的通用对话轨显示 BM25 的稳定贡献，也暴露出大量零召回与多跳证据缺口。学习者记忆因此需要联合评估来源、时序适用性和覆盖，而非仅追求事实召回总分。本文支持关于教育证据处理的系统性发现，真实教学价值仍需独立教师评审、强基线、未见轨迹和前瞻性学习者研究验证。</w:t>
+        <w:t>本文介绍了面向计算机专业教学的证据驱动学习者记忆系统，将学习观察、五维状态、带条件片段与教学动作连接到统一的可追溯链路。其核心设计目标是让画像保留学习表现的发生条件，并为下一步教学提供可检查的依据。在当前规划实现中，消融表明学习片段承担了主题事实匹配之外的评估动作支持职责；历史指导使有效的跨会话教学约束能够延续。时序审计同时表明，真实来源并不足以保证当前适用性：最新前缀准入消除了低预算下观察到的 192 个过时案例，其中 63 个转为一致动作，129 个转为无评估动作。通用对话轨支持 BM25 的词法重排贡献，也显示仍有大量零召回与多跳缺口。</w:t>
+      </w:r>
+    </w:p>
+    <w:p>
+      <w:r>
+        <w:t>这些结果支持将证据形成、条件保留、时序适用性和动作覆盖共同纳入教育记忆评价，不能据此声称完整系统在所有检索任务中占优。当前系统已提供可审计的教学证据组织与读取机制；它能否改善真实学习者的理解、保持与迁移，仍需独立教师评审、未见轨迹、强基线和前瞻性教学研究验证。</w:t>
       </w:r>
     </w:p>
     <w:p>

</xml_diff>

<commit_message>
docs: connect five-kernel memory to teaching services and research gaps
Reframe the Chinese manuscript, redraw the architecture figure, and specify fair representation experiments and engineering follow-ups. Correct no-episode and raw-text interpretations using a reproducible recount of retained logs. Preserve experimental tables and figures 2-4. Contract impact: none; no product changes or new experiments. Validated source hashes, document assertions, and all 22 rendered pages.
</commit_message>
<xml_diff>
--- a/docs/research/education-memory-v2-paper/LearnFlow_Educational_Memory_Manuscript_ZH.docx
+++ b/docs/research/education-memory-v2-paper/LearnFlow_Educational_Memory_Manuscript_ZH.docx
@@ -10,7 +10,7 @@
       <w:r>
         <w:t>面向计算机专业教学的</w:t>
         <w:br/>
-        <w:t>证据驱动学习者记忆</w:t>
+        <w:t>五核学习者记忆系统</w:t>
       </w:r>
     </w:p>
     <w:p>
@@ -23,7 +23,7 @@
     </w:p>
     <w:p>
       <w:r>
-        <w:t>教育智能体需要将持续积累的学习记录转化为可解释、可更新并能支持教学动作的学习者画像。为保留“学了什么”“在何种辅助下完成”以及“当前证据支持哪一步教学”之间的联系，本文介绍服务计算机专业群的 LearnFlow 记忆系统。系统以统一事件归约链维护五维学习者状态，将表现结果、辅助条件、时间和来源组织为学习片段，再通过受预算约束的只读投影支持确定性教学动作。研究采用教育原生证据形成与通用对话检索两条评测路径：1,584 条合成教育轨迹的 12 种配置和 2 档预算，以及 LoCoMo 适配集的 7 种配置和 2 档预算，共形成 65,820 次条件执行。教育轨表明，紧凑事实的主题覆盖与可用于教学的过程证据具有不同作用：移除片段使低预算主题命中由 1,407/1,794 升至 1,640/1,794，却使基于评估证据的动作全部消失。时序审计进一步发现 192 个引用旧评估的案例；连续前缀准入使其中 63 个转为一致动作，129 个转为无评估动作。独立的默认预算补充运行产生 1,311 个时序一致评估动作，273 个案例无适用评估。对 1,438 个有效 LoCoMo 主类别问题，完整系统两档预算的平均证据召回率为 48.81% 和 58.00%，移除 BM25 后下降 3.60 和 3.67 个百分点。结果支持在当前实现中联合检查证据送达、表现条件和教学动作来源，而非仅以事实召回评价画像。教育案例均已被作者查看，独立教师评审尚未完成；本文未证明真实学习收益或生成答案准确率。</w:t>
+        <w:t>长期教育智能体需要同时维护学习位置、概念理解、交互支持、目标优先级和实践表现。知识追踪、开放学习者模型与智能体记忆分别提供状态估计、画像参与和历史访问方法，但这些研究路径的既有评测不能直接回答多类学习证据如何共同约束下一步教学。本文提出并实现 LearnFlow 五核学习者记忆系统，以结构、知识、人因、价值和实践五个维度组织有明确更新边界的学习者状态。系统通过统一事件归约维护画像权威，以带来源和辅助条件的学习片段连接记忆与教学动作，并以版本化投影保留历史解释的变化。针对计算机专业群的既有实现，研究采用 1,584 条合成教育轨迹的 12 种读取配置与 2 档预算，以及 LoCoMo 适配集的 7 种配置与 2 档预算，合计 65,820 次条件执行。移除学习片段使低预算主题命中由 1,407/1,794 升至 1,640/1,794，却使当前规划器的评估动作全部消失；时序准入修正使 192 个过时案例中的 63 个转为一致动作，129 个转为无评估动作。独立默认预算补充运行产生 1,311 个时序一致评估动作，273 个案例无适用评估。对 1,438 个有效 LoCoMo 主类别问题，完整系统两档预算的证据召回率为 48.81% 和 58.00%，移除 BM25 后下降 3.60 和 3.67 个百分点。结果揭示教育记忆需要联合评价信息覆盖、表现条件与动作依据。现有实验支持部分读取机制的作用，尚未隔离五核划分本身的增益。本文进一步提出等证据表示对照、反事实学习轨迹及教师评价方案；这些实验尚未执行。全部教育案例已被作者查看，本文不据此推断真实学习收益。</w:t>
       </w:r>
     </w:p>
     <w:p>
@@ -31,7 +31,7 @@
         <w:ind w:firstLine="0"/>
       </w:pPr>
       <w:r>
-        <w:t>关键词：教育智能体；学习者画像；长期记忆；时序有效性；证据溯源；消融实验；上下文预算</w:t>
+        <w:t>关键词：教育智能体；五核记忆；学习者建模；表现条件；证据溯源；消融实验</w:t>
       </w:r>
     </w:p>
     <w:p>
@@ -59,17 +59,22 @@
     </w:p>
     <w:p>
       <w:r>
-        <w:t>LearnFlow 围绕这一需求构建证据驱动的学习者记忆。结构、知识、人因、价值和实践五个维度提供共同的画像组织方式；统一事件归约链规定哪些观察能够改变状态；带来源的学习片段保留任务结果及其辅助条件；读取端将当前适用证据交给教学规则。其目标是使画像中的判断能够追溯到学习行为，并使教学动作能够说明依据，而不是将一次交互压缩为脱离条件的能力标签。五维组织是本系统的工程设计，本文不预设它优于其他学习者模型。</w:t>
+        <w:t>这些研究路径为教育记忆提供了基础，也留下了需要结合具体系统检验的接口问题。状态预测的正确性不能替代教学证据的完整送达，历史问答的准确性不能替代辅助等级与目标约束的正确使用，画像更新的存在也不能保证多个教学功能采用同一份当前解释。这里的不足是研究目标与测量范围之间尚未接合之处，不是认定既有系统普遍缺少相关功能。本文将其归纳为学习状态的语义分工、证据更新后的适用性和教学使用的可核验性三个问题。</w:t>
       </w:r>
     </w:p>
     <w:p>
       <w:r>
-        <w:t>本文的工作分为三个层次。第一，给出学习观察、状态形成和教学读取之间的统一实现，明确长期画像的写入权威与表现证据的使用条件。第二，以教育消融检验事实检索、学习片段和历史控制在教学准备中的不同职责，联合报告主题覆盖与评估动作，避免把“记住知识点”直接等同于“具备教学依据”。第三，通过时序配对审计及通用对话检索检验这一实现的适用范围，揭示预算裁剪、证据形成和多跳检索的具体缺口。本文贡献属于面向教育的系统设计及可复核的经验分析，不将事件归约、BM25 或时间排序本身宣称为新算法。</w:t>
+        <w:t>LearnFlow 的五核设计据此分配教学责任：结构核支持学习位置与返回，知识核组织概念问题和理解证据，人因核提供明确且有时效的支持需求，价值核维护目标及优先级，实践核保留尝试、辅助和迁移表现。五核共用一个事件账本和归约入口；同一事件可以关联多个维度，但每个状态改变必须有独立证据依据。这样，路径走到某一节点、学习者表示有兴趣和一次受助成功不会互相替代为掌握结论。五核是可检查的工程分工，五这一数量的充分性与最优性需要实证比较。</w:t>
       </w:r>
     </w:p>
     <w:p>
       <w:r>
-        <w:t>全文围绕一个核心问题展开：持续学习记录经过画像形成与有限上下文读取后，是否仍能为下一步教学提供带条件、可追溯的依据。预算导致的旧证据替代是检验这一目标的压力案例；它揭示系统的改进需求，但不替代对学习者记忆整体职责的讨论。</w:t>
+        <w:t>本系统在 LearnFlow 中提供两类直接服务。一类是共享学习状态，使规划、辅导、练习、复习及画像查看能够引用有范围的共同记录；另一类是教学读取，将当前目标、支持约束和带条件的表现证据送达消费者，并为确定性动作保留来源。其设计优势在于把容易混淆的判断显式拆开，又以证据标识连接，而不是要求每个功能自行维护长期学习者摘要。跨功能一致性和用户理解是否因此改善，仍是待检验的性能主张。</w:t>
+      </w:r>
+    </w:p>
+    <w:p>
+      <w:r>
+        <w:t>本文贡献包括：给出按教学决策分工的五核表示及其统一更新与读取机制；以教育原生轨迹和通用对话检索检验若干关键读取机制，区分事实覆盖与教学动作依据；据既有结果和相关论文的方法提出能够直接检验五核价值的后续对照方案。我们将实现特点、已观察效果和待验证假设分别陈述，不把事件归约、图结构、BM25 或多智能体组合本身称为新算法。</w:t>
       </w:r>
     </w:p>
     <w:p>
@@ -82,7 +87,7 @@
     </w:p>
     <w:p>
       <w:r>
-        <w:t>本节采用问题导向的叙述性综述，围绕学习者画像的形成、记忆的组织与更新，以及教学效果的验证梳理代表性研究。文献核验截至 2026 年 9 月 9 日，以原始论文和正式出版记录为依据；这不是穷尽检索的系统综述，也不据此声称某项能力在整个领域中尚不存在。比较的重点是各工作的研究对象、更新机制与实际测量边界，而不是将不同数据集上的分数拼接为排名。</w:t>
+        <w:t>本节采用问题导向的叙述性综述，围绕学习者画像的形成、记忆的组织与更新，以及教学效果的验证梳理代表性研究。本轮于 2026 年 9 月 13 日复核 DeepTutor、LoCoMo 与 LongMemEval 的实验方法，其余文献沿用既有核验，以原始论文和正式出版记录为依据；这不是穷尽检索的系统综述，也不据此声称某项能力在整个领域中尚不存在。比较的重点是各工作的研究对象、更新机制与实际测量边界，而不是将不同数据集上的分数拼接为排名。</w:t>
       </w:r>
     </w:p>
     <w:p>
@@ -942,7 +947,12 @@
     </w:p>
     <w:p>
       <w:r>
-        <w:t>综合上述工作，本文将研究定位于学习者建模与智能体记忆之间的证据接口：学习记录如何形成有共同权威的画像，表现限定如何随记忆送达，以及教学动作如何引用当前适用观察。与 DeepTutor 的讨论有助于明确共享画像及历史更新的相关研究背景，但本文没有统一复现对照，不能据此得出系统优劣结论。下文以可检查的实现说明设计，再用读取端消融衡量其中部分机制；画像可理解性、用户修订体验与真实教学收益需要另行验证。</w:t>
+        <w:t>综合上述工作，可以形成三个面向本系统的研究缺口。首先，知识状态、导航状态、交互需要和任务表现具有不同证据语义，通用画像汇总需要额外约束才能避免跨维度误推。其次，长期历史的检索结果需要保留辅助条件、作用域和更新关系，真实来源本身不足以保证当前适用。最后，记忆评测应连接教学消费者，检查其依据与动作，同时通过独立教学研究验证学习收益。前两个问题构成五核系统的设计动机，第三个决定其评价方式。</w:t>
+      </w:r>
+    </w:p>
+    <w:p>
+      <w:r>
+        <w:t>本文不将这些缺口归咎于单一前人工作。DeepTutor 已研究共享动态画像与教学交互[16]，LongMemEval 已覆盖更新与时序推理[7]，开放学习者模型已关注理解和修订[14,18]。LearnFlow 的研究位置是将按教学责任划分的状态、可追溯更新以及带条件的读取连接为统一实现，并检验这一组合在计算机专业教学任务中的作用。现有结果主要涉及读取机制；五核整体的比较优势需要第 8 节提出的直接实验来确立。</w:t>
       </w:r>
     </w:p>
     <w:p>
@@ -955,7 +965,7 @@
     </w:p>
     <w:p>
       <w:r>
-        <w:t>系统设计依次处理三个问题：谁有权根据观察更新画像，哪些条件必须伴随表现记录保留，以及教学端如何在有限上下文中使用这些证据。写入链解决状态来源的一致性，学习片段解决表现含义的保留，预算准入与动作规则解决证据的实际使用。三者连接在同一链路上，但其效果必须分别测量，不能由架构完整性推定。</w:t>
+        <w:t>系统以统一的学习者身份与作用域组织五核状态，通过事件更新与只读上下文服务连接多个消费者。下文先说明五核分别提供什么，再描述它们如何形成、更新和进入教学决策。</w:t>
       </w:r>
     </w:p>
     <w:p>
@@ -963,7 +973,592 @@
         <w:pStyle w:val="Heading2"/>
       </w:pPr>
       <w:r>
-        <w:t>3.1 学习者画像的权威形成链</w:t>
+        <w:t>3.1 五核的教学分工与产品服务</w:t>
+      </w:r>
+    </w:p>
+    <w:p>
+      <w:r>
+        <w:t>记学习者在时刻 t 的状态为 K(t) = (S(t), N(t), H(t), V(t), P(t))，分别表示结构、知识、人因、价值和实践投影。这里的五元组表示类型化状态容器，不是五个独立概率模型或已验证的心理维度。每次事件由确定性归约器依据类型、来源、范围与证据等级决定其合法目标；某个分量的变化不自动推导其他分量。五核共用主题坐标与来源标识，因此可以在同一概念或任务上组合读取，同时保留各自的结论边界。</w:t>
+      </w:r>
+    </w:p>
+    <w:p>
+      <w:pPr>
+        <w:pStyle w:val="Caption"/>
+        <w:keepNext/>
+      </w:pPr>
+      <w:r>
+        <w:rPr>
+          <w:b/>
+        </w:rPr>
+        <w:t>表 2 五核提供的学习状态与系统用途</w:t>
+      </w:r>
+    </w:p>
+    <w:tbl>
+      <w:tblPr>
+        <w:tblW w:type="auto" w:w="0"/>
+        <w:jc w:val="center"/>
+        <w:tblLayout w:type="fixed"/>
+        <w:tblLook w:firstColumn="1" w:firstRow="1" w:lastColumn="0" w:lastRow="0" w:noHBand="0" w:noVBand="1" w:val="04A0"/>
+        <w:tblBorders>
+          <w:top w:val="single" w:sz="8" w:color="333333"/>
+          <w:bottom w:val="single" w:sz="8" w:color="333333"/>
+          <w:left w:val="nil" w:sz="8" w:color="333333"/>
+          <w:right w:val="nil" w:sz="8" w:color="333333"/>
+          <w:insideH w:val="nil" w:sz="8" w:color="333333"/>
+          <w:insideV w:val="nil" w:sz="8" w:color="333333"/>
+        </w:tblBorders>
+      </w:tblPr>
+      <w:tblGrid>
+        <w:gridCol w:w="1474"/>
+        <w:gridCol w:w="2721"/>
+        <w:gridCol w:w="3515"/>
+        <w:gridCol w:w="2098"/>
+      </w:tblGrid>
+      <w:tr>
+        <w:trPr>
+          <w:cantSplit/>
+          <w:tblHeader/>
+        </w:trPr>
+        <w:tc>
+          <w:tcPr>
+            <w:tcW w:type="dxa" w:w="1474"/>
+            <w:vAlign w:val="center"/>
+            <w:tcBorders>
+              <w:bottom w:val="single" w:sz="4" w:color="777777"/>
+            </w:tcBorders>
+          </w:tcPr>
+          <w:p>
+            <w:pPr>
+              <w:spacing w:before="60" w:after="60" w:line="250" w:lineRule="auto"/>
+              <w:ind w:firstLine="0"/>
+              <w:jc w:val="left"/>
+            </w:pPr>
+            <w:r>
+              <w:rPr>
+                <w:b/>
+                <w:sz w:val="18"/>
+              </w:rPr>
+              <w:t>状态维度</w:t>
+            </w:r>
+          </w:p>
+        </w:tc>
+        <w:tc>
+          <w:tcPr>
+            <w:tcW w:type="dxa" w:w="2721"/>
+            <w:vAlign w:val="center"/>
+            <w:tcBorders>
+              <w:bottom w:val="single" w:sz="4" w:color="777777"/>
+            </w:tcBorders>
+          </w:tcPr>
+          <w:p>
+            <w:pPr>
+              <w:spacing w:before="60" w:after="60" w:line="250" w:lineRule="auto"/>
+              <w:ind w:firstLine="0"/>
+              <w:jc w:val="left"/>
+            </w:pPr>
+            <w:r>
+              <w:rPr>
+                <w:b/>
+                <w:sz w:val="18"/>
+              </w:rPr>
+              <w:t>记忆的核心内容</w:t>
+            </w:r>
+          </w:p>
+        </w:tc>
+        <w:tc>
+          <w:tcPr>
+            <w:tcW w:type="dxa" w:w="3515"/>
+            <w:vAlign w:val="center"/>
+            <w:tcBorders>
+              <w:bottom w:val="single" w:sz="4" w:color="777777"/>
+            </w:tcBorders>
+          </w:tcPr>
+          <w:p>
+            <w:pPr>
+              <w:spacing w:before="60" w:after="60" w:line="250" w:lineRule="auto"/>
+              <w:ind w:firstLine="0"/>
+              <w:jc w:val="left"/>
+            </w:pPr>
+            <w:r>
+              <w:rPr>
+                <w:b/>
+                <w:sz w:val="18"/>
+              </w:rPr>
+              <w:t>在系统中的使用</w:t>
+            </w:r>
+          </w:p>
+        </w:tc>
+        <w:tc>
+          <w:tcPr>
+            <w:tcW w:type="dxa" w:w="2098"/>
+            <w:vAlign w:val="center"/>
+            <w:tcBorders>
+              <w:bottom w:val="single" w:sz="4" w:color="777777"/>
+            </w:tcBorders>
+          </w:tcPr>
+          <w:p>
+            <w:pPr>
+              <w:spacing w:before="60" w:after="60" w:line="250" w:lineRule="auto"/>
+              <w:ind w:firstLine="0"/>
+              <w:jc w:val="left"/>
+            </w:pPr>
+            <w:r>
+              <w:rPr>
+                <w:b/>
+                <w:sz w:val="18"/>
+              </w:rPr>
+              <w:t>判断边界</w:t>
+            </w:r>
+          </w:p>
+        </w:tc>
+      </w:tr>
+      <w:tr>
+        <w:trPr>
+          <w:cantSplit/>
+        </w:trPr>
+        <w:tc>
+          <w:tcPr>
+            <w:tcW w:type="dxa" w:w="1474"/>
+            <w:vAlign w:val="center"/>
+          </w:tcPr>
+          <w:p>
+            <w:pPr>
+              <w:spacing w:before="60" w:after="60" w:line="250" w:lineRule="auto"/>
+              <w:ind w:firstLine="0"/>
+              <w:jc w:val="left"/>
+            </w:pPr>
+            <w:r>
+              <w:rPr>
+                <w:b w:val="0"/>
+                <w:sz w:val="18"/>
+              </w:rPr>
+              <w:t>结构 Structure</w:t>
+            </w:r>
+          </w:p>
+        </w:tc>
+        <w:tc>
+          <w:tcPr>
+            <w:tcW w:type="dxa" w:w="2721"/>
+            <w:vAlign w:val="center"/>
+          </w:tcPr>
+          <w:p>
+            <w:pPr>
+              <w:spacing w:before="60" w:after="60" w:line="250" w:lineRule="auto"/>
+              <w:ind w:firstLine="0"/>
+              <w:jc w:val="left"/>
+            </w:pPr>
+            <w:r>
+              <w:rPr>
+                <w:b w:val="0"/>
+                <w:sz w:val="18"/>
+              </w:rPr>
+              <w:t>位置、依赖、阻塞和返回锚点</w:t>
+            </w:r>
+          </w:p>
+        </w:tc>
+        <w:tc>
+          <w:tcPr>
+            <w:tcW w:type="dxa" w:w="3515"/>
+            <w:vAlign w:val="center"/>
+          </w:tcPr>
+          <w:p>
+            <w:pPr>
+              <w:spacing w:before="60" w:after="60" w:line="250" w:lineRule="auto"/>
+              <w:ind w:firstLine="0"/>
+              <w:jc w:val="left"/>
+            </w:pPr>
+            <w:r>
+              <w:rPr>
+                <w:b w:val="0"/>
+                <w:sz w:val="18"/>
+              </w:rPr>
+              <w:t>学习路径与任务恢复；规划读取下一步约束</w:t>
+            </w:r>
+          </w:p>
+        </w:tc>
+        <w:tc>
+          <w:tcPr>
+            <w:tcW w:type="dxa" w:w="2098"/>
+            <w:vAlign w:val="center"/>
+          </w:tcPr>
+          <w:p>
+            <w:pPr>
+              <w:spacing w:before="60" w:after="60" w:line="250" w:lineRule="auto"/>
+              <w:ind w:firstLine="0"/>
+              <w:jc w:val="left"/>
+            </w:pPr>
+            <w:r>
+              <w:rPr>
+                <w:b w:val="0"/>
+                <w:sz w:val="18"/>
+              </w:rPr>
+              <w:t>到达或学过某节点不等于掌握</w:t>
+            </w:r>
+          </w:p>
+        </w:tc>
+      </w:tr>
+      <w:tr>
+        <w:trPr>
+          <w:cantSplit/>
+        </w:trPr>
+        <w:tc>
+          <w:tcPr>
+            <w:tcW w:type="dxa" w:w="1474"/>
+            <w:vAlign w:val="center"/>
+          </w:tcPr>
+          <w:p>
+            <w:pPr>
+              <w:spacing w:before="60" w:after="60" w:line="250" w:lineRule="auto"/>
+              <w:ind w:firstLine="0"/>
+              <w:jc w:val="left"/>
+            </w:pPr>
+            <w:r>
+              <w:rPr>
+                <w:b w:val="0"/>
+                <w:sz w:val="18"/>
+              </w:rPr>
+              <w:t>知识 Knowledge</w:t>
+            </w:r>
+          </w:p>
+        </w:tc>
+        <w:tc>
+          <w:tcPr>
+            <w:tcW w:type="dxa" w:w="2721"/>
+            <w:vAlign w:val="center"/>
+          </w:tcPr>
+          <w:p>
+            <w:pPr>
+              <w:spacing w:before="60" w:after="60" w:line="250" w:lineRule="auto"/>
+              <w:ind w:firstLine="0"/>
+              <w:jc w:val="left"/>
+            </w:pPr>
+            <w:r>
+              <w:rPr>
+                <w:b w:val="0"/>
+                <w:sz w:val="18"/>
+              </w:rPr>
+              <w:t>概念观察、错误、缺口及评分依据</w:t>
+            </w:r>
+          </w:p>
+        </w:tc>
+        <w:tc>
+          <w:tcPr>
+            <w:tcW w:type="dxa" w:w="3515"/>
+            <w:vAlign w:val="center"/>
+          </w:tcPr>
+          <w:p>
+            <w:pPr>
+              <w:spacing w:before="60" w:after="60" w:line="250" w:lineRule="auto"/>
+              <w:ind w:firstLine="0"/>
+              <w:jc w:val="left"/>
+            </w:pPr>
+            <w:r>
+              <w:rPr>
+                <w:b w:val="0"/>
+                <w:sz w:val="18"/>
+              </w:rPr>
+              <w:t>辅导定位内容；练习与复习选择验证对象</w:t>
+            </w:r>
+          </w:p>
+        </w:tc>
+        <w:tc>
+          <w:tcPr>
+            <w:tcW w:type="dxa" w:w="2098"/>
+            <w:vAlign w:val="center"/>
+          </w:tcPr>
+          <w:p>
+            <w:pPr>
+              <w:spacing w:before="60" w:after="60" w:line="250" w:lineRule="auto"/>
+              <w:ind w:firstLine="0"/>
+              <w:jc w:val="left"/>
+            </w:pPr>
+            <w:r>
+              <w:rPr>
+                <w:b w:val="0"/>
+                <w:sz w:val="18"/>
+              </w:rPr>
+              <w:t>自述接触与生成讲解不升级掌握</w:t>
+            </w:r>
+          </w:p>
+        </w:tc>
+      </w:tr>
+      <w:tr>
+        <w:trPr>
+          <w:cantSplit/>
+        </w:trPr>
+        <w:tc>
+          <w:tcPr>
+            <w:tcW w:type="dxa" w:w="1474"/>
+            <w:vAlign w:val="center"/>
+          </w:tcPr>
+          <w:p>
+            <w:pPr>
+              <w:spacing w:before="60" w:after="60" w:line="250" w:lineRule="auto"/>
+              <w:ind w:firstLine="0"/>
+              <w:jc w:val="left"/>
+            </w:pPr>
+            <w:r>
+              <w:rPr>
+                <w:b w:val="0"/>
+                <w:sz w:val="18"/>
+              </w:rPr>
+              <w:t>人因 Human</w:t>
+            </w:r>
+          </w:p>
+        </w:tc>
+        <w:tc>
+          <w:tcPr>
+            <w:tcW w:type="dxa" w:w="2721"/>
+            <w:vAlign w:val="center"/>
+          </w:tcPr>
+          <w:p>
+            <w:pPr>
+              <w:spacing w:before="60" w:after="60" w:line="250" w:lineRule="auto"/>
+              <w:ind w:firstLine="0"/>
+              <w:jc w:val="left"/>
+            </w:pPr>
+            <w:r>
+              <w:rPr>
+                <w:b w:val="0"/>
+                <w:sz w:val="18"/>
+              </w:rPr>
+              <w:t>明确支持请求、节奏、负荷与讲法偏好</w:t>
+            </w:r>
+          </w:p>
+        </w:tc>
+        <w:tc>
+          <w:tcPr>
+            <w:tcW w:type="dxa" w:w="3515"/>
+            <w:vAlign w:val="center"/>
+          </w:tcPr>
+          <w:p>
+            <w:pPr>
+              <w:spacing w:before="60" w:after="60" w:line="250" w:lineRule="auto"/>
+              <w:ind w:firstLine="0"/>
+              <w:jc w:val="left"/>
+            </w:pPr>
+            <w:r>
+              <w:rPr>
+                <w:b w:val="0"/>
+                <w:sz w:val="18"/>
+              </w:rPr>
+              <w:t>Tutor 呈现适配；规划应用时间与支持约束</w:t>
+            </w:r>
+          </w:p>
+        </w:tc>
+        <w:tc>
+          <w:tcPr>
+            <w:tcW w:type="dxa" w:w="2098"/>
+            <w:vAlign w:val="center"/>
+          </w:tcPr>
+          <w:p>
+            <w:pPr>
+              <w:spacing w:before="60" w:after="60" w:line="250" w:lineRule="auto"/>
+              <w:ind w:firstLine="0"/>
+              <w:jc w:val="left"/>
+            </w:pPr>
+            <w:r>
+              <w:rPr>
+                <w:b w:val="0"/>
+                <w:sz w:val="18"/>
+              </w:rPr>
+              <w:t>临时状态有时效；普通错误不推断人格或情绪</w:t>
+            </w:r>
+          </w:p>
+        </w:tc>
+      </w:tr>
+      <w:tr>
+        <w:trPr>
+          <w:cantSplit/>
+        </w:trPr>
+        <w:tc>
+          <w:tcPr>
+            <w:tcW w:type="dxa" w:w="1474"/>
+            <w:vAlign w:val="center"/>
+          </w:tcPr>
+          <w:p>
+            <w:pPr>
+              <w:spacing w:before="60" w:after="60" w:line="250" w:lineRule="auto"/>
+              <w:ind w:firstLine="0"/>
+              <w:jc w:val="left"/>
+            </w:pPr>
+            <w:r>
+              <w:rPr>
+                <w:b w:val="0"/>
+                <w:sz w:val="18"/>
+              </w:rPr>
+              <w:t>价值 Value</w:t>
+            </w:r>
+          </w:p>
+        </w:tc>
+        <w:tc>
+          <w:tcPr>
+            <w:tcW w:type="dxa" w:w="2721"/>
+            <w:vAlign w:val="center"/>
+          </w:tcPr>
+          <w:p>
+            <w:pPr>
+              <w:spacing w:before="60" w:after="60" w:line="250" w:lineRule="auto"/>
+              <w:ind w:firstLine="0"/>
+              <w:jc w:val="left"/>
+            </w:pPr>
+            <w:r>
+              <w:rPr>
+                <w:b w:val="0"/>
+                <w:sz w:val="18"/>
+              </w:rPr>
+              <w:t>目标候选、确认、优先级及撤回</w:t>
+            </w:r>
+          </w:p>
+        </w:tc>
+        <w:tc>
+          <w:tcPr>
+            <w:tcW w:type="dxa" w:w="3515"/>
+            <w:vAlign w:val="center"/>
+          </w:tcPr>
+          <w:p>
+            <w:pPr>
+              <w:spacing w:before="60" w:after="60" w:line="250" w:lineRule="auto"/>
+              <w:ind w:firstLine="0"/>
+              <w:jc w:val="left"/>
+            </w:pPr>
+            <w:r>
+              <w:rPr>
+                <w:b w:val="0"/>
+                <w:sz w:val="18"/>
+              </w:rPr>
+              <w:t>规划选择当前重点；画像展示目标依据</w:t>
+            </w:r>
+          </w:p>
+        </w:tc>
+        <w:tc>
+          <w:tcPr>
+            <w:tcW w:type="dxa" w:w="2098"/>
+            <w:vAlign w:val="center"/>
+          </w:tcPr>
+          <w:p>
+            <w:pPr>
+              <w:spacing w:before="60" w:after="60" w:line="250" w:lineRule="auto"/>
+              <w:ind w:firstLine="0"/>
+              <w:jc w:val="left"/>
+            </w:pPr>
+            <w:r>
+              <w:rPr>
+                <w:b w:val="0"/>
+                <w:sz w:val="18"/>
+              </w:rPr>
+              <w:t>模型建议不成为已确认长期目标</w:t>
+            </w:r>
+          </w:p>
+        </w:tc>
+      </w:tr>
+      <w:tr>
+        <w:trPr>
+          <w:cantSplit/>
+        </w:trPr>
+        <w:tc>
+          <w:tcPr>
+            <w:tcW w:type="dxa" w:w="1474"/>
+            <w:vAlign w:val="center"/>
+          </w:tcPr>
+          <w:p>
+            <w:pPr>
+              <w:spacing w:before="60" w:after="60" w:line="250" w:lineRule="auto"/>
+              <w:ind w:firstLine="0"/>
+              <w:jc w:val="left"/>
+            </w:pPr>
+            <w:r>
+              <w:rPr>
+                <w:b w:val="0"/>
+                <w:sz w:val="18"/>
+              </w:rPr>
+              <w:t>实践 Practice</w:t>
+            </w:r>
+          </w:p>
+        </w:tc>
+        <w:tc>
+          <w:tcPr>
+            <w:tcW w:type="dxa" w:w="2721"/>
+            <w:vAlign w:val="center"/>
+          </w:tcPr>
+          <w:p>
+            <w:pPr>
+              <w:spacing w:before="60" w:after="60" w:line="250" w:lineRule="auto"/>
+              <w:ind w:firstLine="0"/>
+              <w:jc w:val="left"/>
+            </w:pPr>
+            <w:r>
+              <w:rPr>
+                <w:b w:val="0"/>
+                <w:sz w:val="18"/>
+              </w:rPr>
+              <w:t>尝试、辅助、产物、反馈和迁移表现</w:t>
+            </w:r>
+          </w:p>
+        </w:tc>
+        <w:tc>
+          <w:tcPr>
+            <w:tcW w:type="dxa" w:w="3515"/>
+            <w:vAlign w:val="center"/>
+          </w:tcPr>
+          <w:p>
+            <w:pPr>
+              <w:spacing w:before="60" w:after="60" w:line="250" w:lineRule="auto"/>
+              <w:ind w:firstLine="0"/>
+              <w:jc w:val="left"/>
+            </w:pPr>
+            <w:r>
+              <w:rPr>
+                <w:b w:val="0"/>
+                <w:sz w:val="18"/>
+              </w:rPr>
+              <w:t>练习与纠错；规划安排诊断或独立检查</w:t>
+            </w:r>
+          </w:p>
+        </w:tc>
+        <w:tc>
+          <w:tcPr>
+            <w:tcW w:type="dxa" w:w="2098"/>
+            <w:vAlign w:val="center"/>
+          </w:tcPr>
+          <w:p>
+            <w:pPr>
+              <w:spacing w:before="60" w:after="60" w:line="250" w:lineRule="auto"/>
+              <w:ind w:firstLine="0"/>
+              <w:jc w:val="left"/>
+            </w:pPr>
+            <w:r>
+              <w:rPr>
+                <w:b w:val="0"/>
+                <w:sz w:val="18"/>
+              </w:rPr>
+              <w:t>受助成功、原题重做和独立迁移分别记录</w:t>
+            </w:r>
+          </w:p>
+        </w:tc>
+      </w:tr>
+    </w:tbl>
+    <w:p>
+      <w:pPr>
+        <w:spacing w:after="0" w:line="60" w:lineRule="exact"/>
+      </w:pPr>
+    </w:p>
+    <w:p>
+      <w:r>
+        <w:t>表 2 描述实现责任，不是逐核实验结果。五核的作用还需要消费者实际使用才能成立：检索可提供五核头部、相关事实和片段，规划则消费当前限制、卡点、目标、返回锚点与评估记录；复习工作台还使用原始题目、Attempt 与纠错事件。本文不把只读出现在画像页面上的字段计为已影响教学，也不将所有产品行为归因于记忆。</w:t>
+      </w:r>
+    </w:p>
+    <w:p>
+      <w:r>
+        <w:t>以数据库课程为例，学习者为后端项目学习事务，在并发异常任务中受助通过，随后明确要求每次只讲一步。结构核可记录课程位置与返回锚点，知识核记录该任务揭示的概念问题，实践核保留辅助条件，人因核接收明确支持请求，价值核只按实际确认的项目目标维护优先级。它们共同为下一次讲解与独立检查提供不同依据。这是说明分工的情境示例，不是新增学生观察；只出现受助通过时，系统不得自动补出挫败、动机或稳定掌握。</w:t>
+      </w:r>
+    </w:p>
+    <w:p>
+      <w:pPr>
+        <w:pStyle w:val="Heading2"/>
+      </w:pPr>
+      <w:r>
+        <w:t>3.2 学习者画像的权威形成链</w:t>
       </w:r>
     </w:p>
     <w:p>
@@ -973,7 +1568,7 @@
     </w:p>
     <w:p>
       <w:r>
-        <w:t>五个状态维度具有明确的工程含义。结构维度记录学习位置、依赖与返回锚点；知识维度记录理解相关观察、缺口与错误；人因维度记录明确偏好、负荷、节奏和支持需求；价值维度记录目标、优先级、动机及相关性；实践维度记录尝试、辅助程度、产物与反馈。它们是证据组织维度，不是五个智能体，也不是固定人格类型。一次普通错误不能支持情绪、人格、医学状态或固定学习风格的推断。</w:t>
+        <w:t>事实、模块和声明共享溯源骨架，但依据不同核采用不同的合成门槛与内容约束。新的事实可与当前模块的证据集合形成后继版本；普通细化记录为 REFINES，纠正记录为 SUPERSEDES，旧版本保留。学习者归档、纠正或撤回改变当前有效投影，并保留审计历史。由此，画像提供的是可追问依据、可表达后续变化的解释，而非不可撤销的学习者标签。版本保留和纠正入口属于已实现能力，本研究未测量用户纠正成功率或多消费者更新延迟。</w:t>
       </w:r>
     </w:p>
     <w:p>
@@ -990,7 +1585,7 @@
       <w:r>
         <w:drawing>
           <wp:inline xmlns:a="http://schemas.openxmlformats.org/drawingml/2006/main" xmlns:pic="http://schemas.openxmlformats.org/drawingml/2006/picture">
-            <wp:extent cx="6228000" cy="2893081"/>
+            <wp:extent cx="6228000" cy="3963098"/>
             <wp:docPr id="1" name="Picture 1" descr="图1 学习者状态形成和预算受限读取"/>
             <wp:cNvGraphicFramePr>
               <a:graphicFrameLocks noChangeAspect="1"/>
@@ -1011,7 +1606,7 @@
                   <pic:spPr>
                     <a:xfrm>
                       <a:off x="0" y="0"/>
-                      <a:ext cx="6228000" cy="2893081"/>
+                      <a:ext cx="6228000" cy="3963098"/>
                     </a:xfrm>
                     <a:prstGeom prst="rect"/>
                   </pic:spPr>
@@ -1030,10 +1625,10 @@
         <w:rPr>
           <w:b/>
         </w:rPr>
-        <w:t>图 1 学习者状态形成与上下文准备。</w:t>
+        <w:t>图 1 五核记忆的教学分工与服务链。</w:t>
       </w:r>
       <w:r>
-        <w:t>a，唯一权威写入链及五个状态维度。b，只读证据验证、片段准入和确定性动作准备。实线箭头表示数据处理方向；读取投影与生成计划不构成新的状态写入通道。</w:t>
+        <w:t>a，五个状态维度分别对应教学问题，共用来源与范围。b，事件归约形成当前状态及版本化记忆。c，只读上下文为 Tutor、规划及练习复习提供各自所需的证据，评估后的行为再次经过事件入口。图中产品职责为实现概览，不表示本研究已逐项验证教学效果；消费者还可读取所属业务对象。</w:t>
       </w:r>
     </w:p>
     <w:p>
@@ -1041,7 +1636,7 @@
         <w:pStyle w:val="Heading2"/>
       </w:pPr>
       <w:r>
-        <w:t>3.2 保留教学约束与表现条件的学习片段</w:t>
+        <w:t>3.3 保留教学约束与表现条件的学习片段</w:t>
       </w:r>
     </w:p>
     <w:p>
@@ -1069,7 +1664,7 @@
         <w:pStyle w:val="Heading2"/>
       </w:pPr>
       <w:r>
-        <w:t>3.3 上下文预算与证据整体准入</w:t>
+        <w:t>3.4 上下文预算与证据整体准入</w:t>
       </w:r>
     </w:p>
     <w:p>
@@ -1092,7 +1687,7 @@
         <w:pStyle w:val="Heading2"/>
       </w:pPr>
       <w:r>
-        <w:t>3.4 保持最新前缀的片段准入</w:t>
+        <w:t>3.5 保持最新前缀的片段准入</w:t>
       </w:r>
     </w:p>
     <w:p>
@@ -1252,7 +1847,7 @@
         <w:pStyle w:val="Heading2"/>
       </w:pPr>
       <w:r>
-        <w:t>3.5 从学习证据到下一步教学动作</w:t>
+        <w:t>3.6 从学习证据到下一步教学动作</w:t>
       </w:r>
     </w:p>
     <w:p>
@@ -1288,7 +1883,7 @@
     </w:p>
     <w:p>
       <w:r>
-        <w:t>教育轨与通用对话轨使用不同的形成方式、统计单位与目标。表 2 给出执行规模。合计 65,820 次执行来自相同案例/问题在不同条件下的重复读取，不等于 65,820 名独立学习者，也不增加独立任务族或对话的数量。正式评测不调用 LLM 或网络。</w:t>
+        <w:t>教育轨与通用对话轨使用不同的形成方式、统计单位与目标。表 3 给出执行规模。合计 65,820 次执行来自相同案例/问题在不同条件下的重复读取，不等于 65,820 名独立学习者，也不增加独立任务族或对话的数量。正式评测不调用 LLM 或网络。</w:t>
       </w:r>
     </w:p>
     <w:p>
@@ -1300,7 +1895,7 @@
         <w:rPr>
           <w:b/>
         </w:rPr>
-        <w:t>表 2 两条评测路径的组成</w:t>
+        <w:t>表 3 两条评测路径的组成</w:t>
       </w:r>
     </w:p>
     <w:tbl>
@@ -1975,7 +2570,7 @@
     </w:p>
     <w:p>
       <w:r>
-        <w:t>各教育配置保留相同当前输入，读取相同的形成快照。表 3 给出实际干预语义。这些消融发生在读取端，不能隔离所有配置共享的控制解析器升级。组件“被启用”“命中候选”“被选入上下文”和“满足探针”分别记录；一个从未激活的机制不能据此获得有效性结论。</w:t>
+        <w:t>各教育配置保留相同当前输入，读取相同的形成快照。表 4 给出实际干预语义。这些消融发生在读取端，不能隔离所有配置共享的控制解析器升级。组件“被启用”“命中候选”“被选入上下文”和“满足探针”分别记录；一个从未激活的机制不能据此获得有效性结论。</w:t>
       </w:r>
     </w:p>
     <w:p>
@@ -1987,7 +2582,7 @@
         <w:rPr>
           <w:b/>
         </w:rPr>
-        <w:t>表 3 配置及其具体干预</w:t>
+        <w:t>表 4 配置及其具体干预</w:t>
       </w:r>
     </w:p>
     <w:tbl>
@@ -3023,7 +3618,7 @@
     </w:p>
     <w:p>
       <w:r>
-        <w:t>表 4 报告全部教育消融的主题/来源 Fact 探针结果。full 在两档预算下分别命中 1,407 和 1,725 个探针；移除片段后升至 1,640 和 1,793，分别增加 233 和 68 个。低预算 facts_only 也略高于 full。因此，本实验不支持“增加记忆层级能改善所有查询”的无条件判断。</w:t>
+        <w:t>表 5 报告全部教育消融的主题/来源 Fact 探针结果。full 在两档预算下分别命中 1,407 和 1,725 个探针；移除片段后升至 1,640 和 1,793，分别增加 233 和 68 个。低预算 facts_only 也略高于 full。因此，本实验不支持“增加记忆层级能改善所有查询”的无条件判断。</w:t>
       </w:r>
     </w:p>
     <w:p>
@@ -3035,7 +3630,7 @@
         <w:rPr>
           <w:b/>
         </w:rPr>
-        <w:t>表 4 教育主题及来源事实的送达结果</w:t>
+        <w:t>表 5 教育主题及来源事实的送达结果</w:t>
       </w:r>
     </w:p>
     <w:tbl>
@@ -3921,7 +4516,7 @@
     </w:p>
     <w:p>
       <w:r>
-        <w:t>各配置在两档预算下的原始陈述送达均为 0/1,152，未计入表 4 的分子。其目标事件没有形成对应 MemoryFact，属于从上游形成到下游送达的断点。调整重排不能恢复从未进入可检索事实层的目标。这也说明弱主题探针的较高命中不能替代原文覆盖检查。</w:t>
+        <w:t>各配置在两档预算下的原始陈述送达均为 0/1,152，未计入表 5 的分子。留存形成记录中的这些目标没有对应 MemoryFact；这一现象需要区分教学控制有意不重复事实化与源事件未产生状态变更的情况，不能整体解释为原始数据丢失。目标原文仍可能保留在事件账本中，而逐字探针检查的是它是否实际进入读取包。调整事实重排不能恢复尚未进入该候选通路的原文；主题探针的较高命中也不能替代这一检查。 本轮对留存日志的事后重计数进一步区分了 430 个已产生 Mutation 但无 Fact 的目标，以及 722 个未关联 Mutation 的目标；后者尚未逐条语义审定，不能全部认定为解析失败。该重计数用于解释既有 0/1,152，不是新运行或对原标签的修改。</w:t>
       </w:r>
     </w:p>
     <w:p>
@@ -3986,7 +4581,7 @@
     </w:p>
     <w:p>
       <w:r>
-        <w:t>移除片段后，只剩时间控制类动作，基于评估证据的动作全部消失。主题匹配的增加因而伴随过程限定证据的丧失。原子事实提供紧凑检索锚点，结构化片段提供解释表现所需的条件，二者在当前预算和规划实现下具有不同作用。</w:t>
+        <w:t>移除片段后，只剩时间控制类动作，基于评估证据的动作全部消失。留存计划的事后重计数显示，该配置在每档预算下仍产生 144 个时间限制动作。主题匹配的增加因而伴随过程限定证据的丧失。原子事实提供紧凑检索锚点，结构化片段提供解释表现所需的条件，二者在当前预算和规划实现下具有不同作用。 在本批轨迹中，评估动作所需的有效历史反馈未通过其他指导通路送达，因此 no_episodes 的评估动作全零首先验证这批执行对片段通路的依赖，不能单独证明片段表示优于信息等价的事实或摘要。直接比较表示质量需要让各表示经过相同适配接口到达同一消费者，并保持结果、辅助条件、时间与来源等信息一致。</w:t>
       </w:r>
     </w:p>
     <w:p>
@@ -4011,7 +4606,7 @@
         <w:rPr>
           <w:b/>
         </w:rPr>
-        <w:t>表 5 LoCoMo 主类别的证据检索结果</w:t>
+        <w:t>表 6 LoCoMo 主类别的证据检索结果</w:t>
       </w:r>
     </w:p>
     <w:tbl>
@@ -5014,7 +5609,7 @@
     </w:p>
     <w:p>
       <w:r>
-        <w:t>原始陈述探针的全零结果还提示，检索优化前应先检查证据形成断点。若目标原文没有形成可检索表示，增加语义重排或图扩展不能解决上游缺失。后续实验应分别衡量原文进入系统、形成事实、获得候选、被预算接纳和支持动作各阶段，定位真正的损失位置。</w:t>
+        <w:t>原始陈述探针的全零结果还提示，检索优化前应先检查证据形成与路由。教学控制不重复巩固为长期事实有其设计理由；确需回溯的学习原话则需要受范围约束的读取路径。后续实验应分别衡量原文记录、控制或观察分流、事实形成、候选获取、预算准入和动作使用，区分设计排除、未覆盖语义与实际丢失。</w:t>
       </w:r>
     </w:p>
     <w:p>
@@ -5033,6 +5628,34 @@
     <w:p>
       <w:r>
         <w:t>有价值的下一轮比较应固定索引证据、访问限制、上下文成本和读取模型，对比词法、稠密、混合、长上下文及代表性智能体记忆基线，并同时报告答案质量和证据支持。别名、错拼、跨时间和多跳场景需要足够的真实激活案例。实验设计还应冻结未见任务族、引入独立教师标注，再研究真实学习者的保持与迁移。以上属于后续研究，未计入本文结果。</w:t>
+      </w:r>
+    </w:p>
+    <w:p>
+      <w:pPr>
+        <w:pStyle w:val="Heading2"/>
+      </w:pPr>
+      <w:r>
+        <w:t>6.4 从研究缺口到工程改进</w:t>
+      </w:r>
+    </w:p>
+    <w:p>
+      <w:r>
+        <w:t>本轮源码审查提出四项优先改进，均尚未实施，也不计入已有实验收益。第一，将不同层的能力资格判断归并为共享的类型化规则。当前普通概念评分、间隔复习和记忆声明校验分别维护不同门槛；Worker 对 stable_mastery 的局部检查与文本降格并未直接等同于复习中的间隔和变式要求。这构成 Claim 类型与能力资格之间需要验证的一致性风险，尚无本轮端到端复现，不能据此声称线上已经错误升级 KernelState。正式离线实验采用的确定性合成器生成 record 类型，该风险也不是本批结果中的已观测误判。后续应检查候选生成、声明类型与当前画像消费的完整路径，再统一资格与策略版本。</w:t>
+      </w:r>
+    </w:p>
+    <w:p>
+      <w:r>
+        <w:t>第二，明确分离原话回溯、教学控制与能力证据。保留原文的事件不必全部变成长期事实，但读取器应能在授权范围内按来源引用返回必要原文及否定、例外和未知条件；需要产生新状态时，仍须通过引用原事件的派生 EvidenceEvent。该设计可以提高审计与教学解释的完整性，同时保留“不将自述视为掌握”的边界。</w:t>
+      </w:r>
+    </w:p>
+    <w:p>
+      <w:r>
+        <w:t>第三，建立面向多种评估入口的共同证据适配器。当前学习片段只支持有限评估事件，题目之间的规范关系仍可能未知。后续可增量接入复习、纠错变式和验证过的项目产物，提供真实题目家族、任务角色及条件字段。平面事实、摘要与五核投影应通过同一接口进入动作规则，使实验能够比较表示质量，而非比较哪一种表示被规划器识别。</w:t>
+      </w:r>
+    </w:p>
+    <w:p>
+      <w:r>
+        <w:t>第四，采用分级证据预算并完善更新审计。先为最新适用评估保留来源、时间、结果、辅助、范围及未知项，再在剩余预算内增加正文；该方案需验证是否遗漏解释动作所必需的限制条件。记忆反馈请求还应具有稳定请求标识，使重试能够复用原结果；现接口使用服务器时间参与事件身份，值得补充请求级幂等回归。所有改进必须保持唯一事件写入链，旧记录保留策略版本，跨端兼容与历史迁移分别验证。</w:t>
       </w:r>
     </w:p>
     <w:p>
@@ -5078,17 +5701,127 @@
         <w:pStyle w:val="Heading1"/>
       </w:pPr>
       <w:r>
-        <w:t>8 结论</w:t>
+        <w:t>8 五核整体价值的后续验证方案</w:t>
       </w:r>
     </w:p>
     <w:p>
       <w:r>
-        <w:t>本文介绍了面向计算机专业教学的证据驱动学习者记忆系统，将学习观察、五维状态、带条件片段与教学动作连接到统一的可追溯链路。其核心设计目标是让画像保留学习表现的发生条件，并为下一步教学提供可检查的依据。在当前规划实现中，消融表明学习片段承担了主题事实匹配之外的评估动作支持职责；历史指导使有效的跨会话教学约束能够延续。时序审计同时表明，真实来源并不足以保证当前适用性：最新前缀准入消除了低预算下观察到的 192 个过时案例，其中 63 个转为一致动作，129 个转为无评估动作。通用对话轨支持 BM25 的词法重排贡献，也显示仍有大量零召回与多跳缺口。</w:t>
+        <w:t>本节为尚未执行的研究方案，依据已有结果提出，不构成新增实验结论或预注册记录。目标是直接检验五核分工及系统服务，避免继续用读取组件的消融间接代替整体架构评价。</w:t>
+      </w:r>
+    </w:p>
+    <w:p>
+      <w:pPr>
+        <w:pStyle w:val="Heading2"/>
+      </w:pPr>
+      <w:r>
+        <w:t>8.1 研究假设与等信息对照</w:t>
       </w:r>
     </w:p>
     <w:p>
       <w:r>
-        <w:t>这些结果支持将证据形成、条件保留、时序适用性和动作覆盖共同纳入教育记忆评价，不能据此声称完整系统在所有检索任务中占优。当前系统已提供可审计的教学证据组织与读取机制；它能否改善真实学习者的理解、保持与迁移，仍需独立教师评审、未见轨迹、强基线和前瞻性教学研究验证。</w:t>
+        <w:t>主要假设是：在证据内容与教学消费者相同的条件下，按教学责任组织的五核读取能够减少跨维度误推，并提高需要多类学习状态的动作适用性。该假设允许被否定；若平面结构达到相同效果且成本更低，应相应缩小五核的性能主张。</w:t>
+      </w:r>
+    </w:p>
+    <w:p>
+      <w:r>
+        <w:t>拟设置三个不同问题的对照。表示对照比较五核分组与平面类型化事实，保留相同事件、结果、辅助、时间、目标和来源，使用相同中间字段与动作接口；不能让平面基线缺少完整系统独有的输入字段。分工对照保持全部信息，仅合并知识与实践的组织标签，或将五组改为按固定随机规则分组，以检验教育语义分工是否超出普通分组效果。信息消融则逐核遮蔽，并另设结构与知识、人因与价值等相关组合；这会减少信息，只能解释相应信息的边际作用，不能单独证明五核表示优越。</w:t>
+      </w:r>
+    </w:p>
+    <w:p>
+      <w:r>
+        <w:t>固定已选证据的第一阶段属于接口等价性校准：规范化后的字段完全相同时，确定性规则应产生相同动作，不能把这种按设计相同的结果当成架构性能实验。主要表示比较在第二阶段进行，允许不同组织方式从同一候选集合选择证据，或由同一冻结读出模型解释等信息输入，再经共同接口校验。若差异只来自基线字段不被识别，必须先修复适配，再评价检索、利用和成本。</w:t>
+      </w:r>
+    </w:p>
+    <w:p>
+      <w:r>
+        <w:t>各条件固定课程资料、历史证据、查询、模型版本、生成预算和教学执行规则。画像头部、指导、片段、概念附件与当前输入等所有通路都要记录，逐核遮蔽须检查旁路残留。当前输入中的明确指令作为共同控制保留，与历史记忆能力分开评分。预算同时采用固定上限及相同信息完整送达两种分析；前者允许报告真实占用差异，后者用于分离组织与遗漏效应。不得用额外无关文本机械填满预算后声称已消除混杂。</w:t>
+      </w:r>
+    </w:p>
+    <w:p>
+      <w:pPr>
+        <w:pStyle w:val="Heading2"/>
+      </w:pPr>
+      <w:r>
+        <w:t>8.2 成对轨迹与独立标注</w:t>
+      </w:r>
+    </w:p>
+    <w:p>
+      <w:r>
+        <w:t>借鉴 DeepTutor 的课程材料、学习者条件与交互任务配套设计[16]，拟构建计算机课程的多会话任务族。每个任务族围绕同一学习目标构造最小差异轨迹，只改变辅助等级、原题与变式身份、新旧结果顺序、目标确认或支持请求有效期中的一项。包含多核共同相关和某核无关的情况；例如支持请求改变讲解节奏时，概念掌握结论应保持不变。跨学习者、跨项目、未来记录与重复请求应进入真实产品入口测试，不能由适配器预先过滤后计作防护成功。</w:t>
+      </w:r>
+    </w:p>
+    <w:p>
+      <w:r>
+        <w:t>新任务应包含真实代码调试、SQL 执行、系统行为分析和项目产物验证，记录实际测试结果、提示暴露、原题重试与变式来源；现有二选一识别适配保留为回归，不替代这些实践任务。学习者原话与代码产物按来源分别标注，不从执行成功推定概念理解。</w:t>
+      </w:r>
+    </w:p>
+    <w:p>
+      <w:r>
+        <w:t>参考 LoCoMo 的证据位置标注和总结事实评价[6]，每条轨迹保存原始证据区间、事件顺序、允许的状态变化、不得推断的结论及动作依据。由计算机课程教师独立标注允许动作集合和禁止动作，先处理标注分歧，再冻结评审规范与标签；不能把当前规划器输出直接作为正确答案。总结任务分别检查原子陈述、辅助限定和状态变化的精确率与召回率，从而补足现有事实标识探针的语义盲点。</w:t>
+      </w:r>
+    </w:p>
+    <w:p>
+      <w:r>
+        <w:t>开发、验证和测试按任务族隔离，同一模板、概念变体和配对轨迹不得跨集合。旧的作者已见案例只用于回归；新测试材料应在标注冻结后保持对调参人员不可见。计划规模与正式样本数须分别登记，以预先声明的最小有意义效应、任务族聚类和预实验方差确定最终规模，不以重复条件执行次数充当独立样本量。</w:t>
+      </w:r>
+    </w:p>
+    <w:p>
+      <w:pPr>
+        <w:pStyle w:val="Heading2"/>
+      </w:pPr>
+      <w:r>
+        <w:t>8.3 分阶段诊断与教学评价</w:t>
+      </w:r>
+    </w:p>
+    <w:p>
+      <w:r>
+        <w:t>借鉴 LongMemEval 对检索与最终问答的分别测量，以及预算下的粒度比较与完整证据诊断[7]，拟同时保存原始已标注证据、形成后的记忆、实际读取包及最终教学输出。仅在离线诊断中，将全部适用证据送入共同适配器，测量理想证据输入下的动作表现；它不含参考答案或标签，不能作为可部署基线，也不计入受预算约束系统的成绩。形成后已有证据与完整证据输入之间的差异帮助定位形成缺口，实际检索包与形成后证据之间的差异定位召回和预算损失，证据已送达仍错误则定位利用问题。</w:t>
+      </w:r>
+    </w:p>
+    <w:p>
+      <w:r>
+        <w:t>五核对应的指标分别是路径返回与依赖符合、概念依据匹配、有效支持请求遵从、目标确认与更新遵从，以及辅助和迁移条件保真。跨核共同报告无依据状态升级、当前证据动作覆盖、过时动作与无动作比例。每项指标使用自己的可评估分母，并披露机制启用、候选命中、实际送达和使用比例；不能把没有适用记录的案例全部当作正确拒答。</w:t>
+      </w:r>
+    </w:p>
+    <w:p>
+      <w:r>
+        <w:t>借鉴 DeepTutor 的模拟交互与独立评审，将生成的解释和练习另行评价[16]。保持导师模型、学生模拟器、课程检索材料和交互预算一致；画像中的隐藏知识缺口仅作为模拟器条件与评审依据，不直接注入导师记忆。教师盲评先校准适切性、证据支持、辅助递减和问题难度等维度；模型评分只作为辅助，不用自评或同源规则评分替代独立标签。模拟器结果须与真实教学效果分开报告。</w:t>
+      </w:r>
+    </w:p>
+    <w:p>
+      <w:pPr>
+        <w:pStyle w:val="Heading2"/>
+      </w:pPr>
+      <w:r>
+        <w:t>8.4 学习收益与统计计划</w:t>
+      </w:r>
+    </w:p>
+    <w:p>
+      <w:r>
+        <w:t>借鉴 Tutor CoPilot 的随机分配和预先确定结局的思路[17]，真实计算机教学研究应先做无辅助前测，按前测分层随机，并预先将其设为协变量；比较独立变式后测、延迟保持、迁移及画像纠正成功率。两组提供相同课程材料与学习时间，记录实际提示、教师介入、任务完成和缺测；按学习者分配时控制跨组污染，按班级或教师分配时在对应层级估计不确定性。试验方案、伦理程序和样本量计算应在招募与分析前完成。</w:t>
+      </w:r>
+    </w:p>
+    <w:p>
+      <w:r>
+        <w:t>离线实验按同一轨迹与预算配对，并以任务族聚类计算区间；通用对话仍以对话为群组。预先指定五核与平面表示的主要比较，其余组件和组合分析标为次要或探索性，并控制多重比较。结果应分领域、证据类型、历史长度和预算呈现，同时报告错误严重程度与成本。真实学习试验按预先分配条件进行主要分析，保留流失和依从性说明。若主要比较未显示五核优势，应如实报告零结果，并检验架构简化是否更合理。</w:t>
+      </w:r>
+    </w:p>
+    <w:p>
+      <w:pPr>
+        <w:pStyle w:val="Heading1"/>
+      </w:pPr>
+      <w:r>
+        <w:t>9 结论</w:t>
+      </w:r>
+    </w:p>
+    <w:p>
+      <w:r>
+        <w:t>本文介绍了面向计算机专业教学的五核学习者记忆系统。结构、知识、人因、价值和实践分别承担导航、理解证据、交互支持、目标优先级和表现验证职责；它们通过统一事件归约与可追溯记忆版本协作，为规划、辅导、练习复习及画像查看提供共同的学习状态依据。这一设计将学习位置、兴趣、自述与受助表现的不同含义保留下来，并使教学动作能够回到其证据来源。</w:t>
+      </w:r>
+    </w:p>
+    <w:p>
+      <w:r>
+        <w:t>既有消融支持学习片段、历史指导和词法重排在当前读取实现中的部分作用，也揭示了最新证据遗漏、原文回溯覆盖范围和多跳检索不足。其证据范围尚不足以证明五核划分相对其他画像表示具有独立优势，更不能推断真实学习收益。后续研究应先完成等证据表示对照与逐核干预，再通过反事实轨迹、教师评价和真实学习任务检验五核分工是否改善教学。本文因此给出一个已实现、部分机制已评估的教育记忆系统，以及明确可证伪的整体价值验证路径。</w:t>
       </w:r>
     </w:p>
     <w:p>

</xml_diff>